<commit_message>
docs: rewrite section 2.3 with smart DB init, enforce dual-font (宋体 + Times New Roman)
</commit_message>
<xml_diff>
--- a/实验报告_数据分析智能体.docx
+++ b/实验报告_数据分析智能体.docx
@@ -10,7 +10,7 @@
       </w:pPr>
       <w:r>
         <w:rPr>
-          <w:rFonts w:ascii="黑体" w:hAnsi="黑体" w:eastAsia="黑体"/>
+          <w:rFonts w:ascii="Times New Roman" w:hAnsi="Times New Roman" w:eastAsia="宋体"/>
           <w:b/>
           <w:sz w:val="44"/>
         </w:rPr>
@@ -23,7 +23,7 @@
       </w:pPr>
       <w:r>
         <w:rPr>
-          <w:rFonts w:ascii="黑体" w:hAnsi="黑体" w:eastAsia="黑体"/>
+          <w:rFonts w:ascii="Times New Roman" w:hAnsi="Times New Roman" w:eastAsia="宋体"/>
           <w:b/>
           <w:sz w:val="44"/>
         </w:rPr>
@@ -37,7 +37,7 @@
       </w:pPr>
       <w:r>
         <w:rPr>
-          <w:rFonts w:ascii="黑体" w:hAnsi="黑体" w:eastAsia="黑体"/>
+          <w:rFonts w:ascii="Times New Roman" w:hAnsi="Times New Roman" w:eastAsia="宋体"/>
           <w:b/>
           <w:sz w:val="44"/>
         </w:rPr>
@@ -52,7 +52,7 @@
       </w:pPr>
       <w:r>
         <w:rPr>
-          <w:rFonts w:ascii="宋体" w:hAnsi="宋体" w:eastAsia="宋体"/>
+          <w:rFonts w:ascii="Times New Roman" w:hAnsi="Times New Roman" w:eastAsia="宋体"/>
           <w:sz w:val="28"/>
         </w:rPr>
         <w:t>作业题目：数据分析智能体的设计与实现</w:t>
@@ -65,7 +65,7 @@
       </w:pPr>
       <w:r>
         <w:rPr>
-          <w:rFonts w:ascii="宋体" w:hAnsi="宋体" w:eastAsia="宋体"/>
+          <w:rFonts w:ascii="Times New Roman" w:hAnsi="Times New Roman" w:eastAsia="宋体"/>
           <w:sz w:val="28"/>
         </w:rPr>
         <w:t>团队成员：</w:t>
@@ -77,7 +77,7 @@
       </w:pPr>
       <w:r>
         <w:rPr>
-          <w:rFonts w:ascii="宋体" w:hAnsi="宋体" w:eastAsia="宋体"/>
+          <w:rFonts w:ascii="Times New Roman" w:hAnsi="Times New Roman" w:eastAsia="宋体"/>
           <w:sz w:val="28"/>
         </w:rPr>
         <w:t xml:space="preserve">  组长：XXX  学号：XXXXXXXXXX</w:t>
@@ -89,7 +89,7 @@
       </w:pPr>
       <w:r>
         <w:rPr>
-          <w:rFonts w:ascii="宋体" w:hAnsi="宋体" w:eastAsia="宋体"/>
+          <w:rFonts w:ascii="Times New Roman" w:hAnsi="Times New Roman" w:eastAsia="宋体"/>
           <w:sz w:val="28"/>
         </w:rPr>
         <w:t xml:space="preserve">  组员：XXX  学号：XXXXXXXXXX</w:t>
@@ -102,7 +102,7 @@
       </w:pPr>
       <w:r>
         <w:rPr>
-          <w:rFonts w:ascii="宋体" w:hAnsi="宋体" w:eastAsia="宋体"/>
+          <w:rFonts w:ascii="Times New Roman" w:hAnsi="Times New Roman" w:eastAsia="宋体"/>
           <w:sz w:val="28"/>
         </w:rPr>
         <w:t>2025-2026 学年春季学期</w:t>
@@ -115,7 +115,7 @@
       </w:pPr>
       <w:r>
         <w:rPr>
-          <w:rFonts w:ascii="宋体" w:hAnsi="宋体" w:eastAsia="宋体"/>
+          <w:rFonts w:ascii="Times New Roman" w:hAnsi="Times New Roman" w:eastAsia="宋体"/>
           <w:sz w:val="28"/>
         </w:rPr>
         <w:t>主讲教师：林子雨</w:t>
@@ -123,6 +123,9 @@
     </w:p>
     <w:p>
       <w:r>
+        <w:rPr>
+          <w:rFonts w:ascii="Times New Roman" w:hAnsi="Times New Roman" w:eastAsia="宋体"/>
+        </w:rPr>
         <w:br w:type="page"/>
       </w:r>
     </w:p>
@@ -131,16 +134,25 @@
         <w:pStyle w:val="Heading1"/>
       </w:pPr>
       <w:r>
+        <w:rPr>
+          <w:rFonts w:ascii="Times New Roman" w:hAnsi="Times New Roman" w:eastAsia="宋体"/>
+        </w:rPr>
         <w:t>目录</w:t>
       </w:r>
     </w:p>
     <w:p>
       <w:r>
+        <w:rPr>
+          <w:rFonts w:ascii="Times New Roman" w:hAnsi="Times New Roman" w:eastAsia="宋体"/>
+        </w:rPr>
         <w:t>（请在 Word 中使用 引用 &gt; 目录 自动生成）</w:t>
       </w:r>
     </w:p>
     <w:p>
       <w:r>
+        <w:rPr>
+          <w:rFonts w:ascii="Times New Roman" w:hAnsi="Times New Roman" w:eastAsia="宋体"/>
+        </w:rPr>
         <w:br w:type="page"/>
       </w:r>
     </w:p>
@@ -149,6 +161,9 @@
         <w:pStyle w:val="Heading1"/>
       </w:pPr>
       <w:r>
+        <w:rPr>
+          <w:rFonts w:ascii="Times New Roman" w:hAnsi="Times New Roman" w:eastAsia="宋体"/>
+        </w:rPr>
         <w:t>一、需求分析</w:t>
       </w:r>
     </w:p>
@@ -157,6 +172,9 @@
         <w:pStyle w:val="Heading2"/>
       </w:pPr>
       <w:r>
+        <w:rPr>
+          <w:rFonts w:ascii="Times New Roman" w:hAnsi="Times New Roman" w:eastAsia="宋体"/>
+        </w:rPr>
         <w:t>1.1 作业目标</w:t>
       </w:r>
     </w:p>
@@ -165,6 +183,9 @@
         <w:ind w:firstLine="425"/>
       </w:pPr>
       <w:r>
+        <w:rPr>
+          <w:rFonts w:ascii="Times New Roman" w:hAnsi="Times New Roman" w:eastAsia="宋体"/>
+        </w:rPr>
         <w:t>本项目旨在综合运用 Python 数据处理、关系数据库建模、SQL 查询、数据可视化和大模型应用开发技术，围绕 AI 就业市场真实数据集，设计并实现一个能够回答业务分析问题的数据智能体（Data Agent）。系统接受用户以自然语言提出的分析问题，自动生成 SQL 查询，执行查询并返回结果，最后由大模型生成中文分析结论。</w:t>
       </w:r>
     </w:p>
@@ -173,6 +194,9 @@
         <w:pStyle w:val="Heading2"/>
       </w:pPr>
       <w:r>
+        <w:rPr>
+          <w:rFonts w:ascii="Times New Roman" w:hAnsi="Times New Roman" w:eastAsia="宋体"/>
+        </w:rPr>
         <w:t>1.2 系统功能概述</w:t>
       </w:r>
     </w:p>
@@ -181,6 +205,9 @@
         <w:ind w:firstLine="425"/>
       </w:pPr>
       <w:r>
+        <w:rPr>
+          <w:rFonts w:ascii="Times New Roman" w:hAnsi="Times New Roman" w:eastAsia="宋体"/>
+        </w:rPr>
         <w:t>本系统具备以下核心功能：</w:t>
       </w:r>
     </w:p>
@@ -189,6 +216,9 @@
         <w:pStyle w:val="ListBullet"/>
       </w:pPr>
       <w:r>
+        <w:rPr>
+          <w:rFonts w:ascii="Times New Roman" w:hAnsi="Times New Roman" w:eastAsia="宋体"/>
+        </w:rPr>
         <w:t>自然语言查询：用户输入中文或英文问题，系统自动生成 SQL 并执行</w:t>
       </w:r>
     </w:p>
@@ -197,6 +227,9 @@
         <w:pStyle w:val="ListBullet"/>
       </w:pPr>
       <w:r>
+        <w:rPr>
+          <w:rFonts w:ascii="Times New Roman" w:hAnsi="Times New Roman" w:eastAsia="宋体"/>
+        </w:rPr>
         <w:t>双引擎支持：支持 DeepSeek 云端 API 和本地 GPU（llama.cpp）两种推理后端</w:t>
       </w:r>
     </w:p>
@@ -205,6 +238,9 @@
         <w:pStyle w:val="ListBullet"/>
       </w:pPr>
       <w:r>
+        <w:rPr>
+          <w:rFonts w:ascii="Times New Roman" w:hAnsi="Times New Roman" w:eastAsia="宋体"/>
+        </w:rPr>
         <w:t>三模版自适应可视化：双轴趋势图、纯时间线图、分类柱状图，自动匹配最优图表</w:t>
       </w:r>
     </w:p>
@@ -213,6 +249,9 @@
         <w:pStyle w:val="ListBullet"/>
       </w:pPr>
       <w:r>
+        <w:rPr>
+          <w:rFonts w:ascii="Times New Roman" w:hAnsi="Times New Roman" w:eastAsia="宋体"/>
+        </w:rPr>
         <w:t>AI 分析摘要：每次查询后由大模型生成中文商业分析结论</w:t>
       </w:r>
     </w:p>
@@ -221,6 +260,9 @@
         <w:pStyle w:val="ListBullet"/>
       </w:pPr>
       <w:r>
+        <w:rPr>
+          <w:rFonts w:ascii="Times New Roman" w:hAnsi="Times New Roman" w:eastAsia="宋体"/>
+        </w:rPr>
         <w:t>预置分析模板：提供 8 个一键执行的预设查询，覆盖薪资、技能、市场等维度</w:t>
       </w:r>
     </w:p>
@@ -229,6 +271,9 @@
         <w:pStyle w:val="ListBullet"/>
       </w:pPr>
       <w:r>
+        <w:rPr>
+          <w:rFonts w:ascii="Times New Roman" w:hAnsi="Times New Roman" w:eastAsia="宋体"/>
+        </w:rPr>
         <w:t>双层语义防火墙：LLM 输出解析 + 运行时 SQL 关键字拦截，双重保障数据库安全</w:t>
       </w:r>
     </w:p>
@@ -237,11 +282,17 @@
         <w:pStyle w:val="ListBullet"/>
       </w:pPr>
       <w:r>
+        <w:rPr>
+          <w:rFonts w:ascii="Times New Roman" w:hAnsi="Times New Roman" w:eastAsia="宋体"/>
+        </w:rPr>
         <w:t>21 项自动化单元测试：确保核心解析函数 100% 回归安全</w:t>
       </w:r>
     </w:p>
     <w:p>
       <w:r>
+        <w:rPr>
+          <w:rFonts w:ascii="Times New Roman" w:hAnsi="Times New Roman" w:eastAsia="宋体"/>
+        </w:rPr>
         <w:br w:type="page"/>
       </w:r>
     </w:p>
@@ -250,6 +301,9 @@
         <w:pStyle w:val="Heading1"/>
       </w:pPr>
       <w:r>
+        <w:rPr>
+          <w:rFonts w:ascii="Times New Roman" w:hAnsi="Times New Roman" w:eastAsia="宋体"/>
+        </w:rPr>
         <w:t>二、数据集获取与预处理</w:t>
       </w:r>
     </w:p>
@@ -258,6 +312,9 @@
         <w:pStyle w:val="Heading2"/>
       </w:pPr>
       <w:r>
+        <w:rPr>
+          <w:rFonts w:ascii="Times New Roman" w:hAnsi="Times New Roman" w:eastAsia="宋体"/>
+        </w:rPr>
         <w:t>2.1 数据集来源</w:t>
       </w:r>
     </w:p>
@@ -266,6 +323,9 @@
         <w:ind w:firstLine="425"/>
       </w:pPr>
       <w:r>
+        <w:rPr>
+          <w:rFonts w:ascii="Times New Roman" w:hAnsi="Times New Roman" w:eastAsia="宋体"/>
+        </w:rPr>
         <w:t>本项目使用的数据集来自 Kaggle 平台，名称为"AI Jobs Market 2025-2026 Salaries"，由用户 alitaqishah 发布。数据集包含 1,500 条真实的 AI 岗位招聘信息，涵盖职位名称、类别、经验要求、薪资、技能、地点、行业等 25 个字段。</w:t>
       </w:r>
     </w:p>
@@ -274,6 +334,9 @@
         <w:ind w:firstLine="425"/>
       </w:pPr>
       <w:r>
+        <w:rPr>
+          <w:rFonts w:ascii="Times New Roman" w:hAnsi="Times New Roman" w:eastAsia="宋体"/>
+        </w:rPr>
         <w:t>数据集下载命令：</w:t>
       </w:r>
     </w:p>
@@ -283,7 +346,7 @@
       </w:pPr>
       <w:r>
         <w:rPr>
-          <w:rFonts w:ascii="Courier New" w:hAnsi="Courier New"/>
+          <w:rFonts w:ascii="Times New Roman" w:hAnsi="Times New Roman" w:eastAsia="宋体"/>
           <w:sz w:val="18"/>
         </w:rPr>
         <w:t>kaggle datasets download -d alitaqishah/ai-jobs-market-2025-2026-salaries -p data --unzip</w:t>
@@ -294,6 +357,9 @@
         <w:pStyle w:val="Heading2"/>
       </w:pPr>
       <w:r>
+        <w:rPr>
+          <w:rFonts w:ascii="Times New Roman" w:hAnsi="Times New Roman" w:eastAsia="宋体"/>
+        </w:rPr>
         <w:t>2.2 数据预处理流程</w:t>
       </w:r>
     </w:p>
@@ -302,6 +368,9 @@
         <w:ind w:firstLine="425"/>
       </w:pPr>
       <w:r>
+        <w:rPr>
+          <w:rFonts w:ascii="Times New Roman" w:hAnsi="Times New Roman" w:eastAsia="宋体"/>
+        </w:rPr>
         <w:t>数据预处理在 scripts/init_db.py 的 clean_dataframe() 函数中完成，使用 pandas 进行以下操作：</w:t>
       </w:r>
     </w:p>
@@ -328,6 +397,7 @@
             </w:pPr>
             <w:r>
               <w:rPr>
+                <w:rFonts w:ascii="Times New Roman" w:hAnsi="Times New Roman" w:eastAsia="宋体"/>
                 <w:b/>
               </w:rPr>
               <w:t>处理步骤</w:t>
@@ -344,6 +414,7 @@
             </w:pPr>
             <w:r>
               <w:rPr>
+                <w:rFonts w:ascii="Times New Roman" w:hAnsi="Times New Roman" w:eastAsia="宋体"/>
                 <w:b/>
               </w:rPr>
               <w:t>具体操作</w:t>
@@ -360,6 +431,7 @@
             </w:pPr>
             <w:r>
               <w:rPr>
+                <w:rFonts w:ascii="Times New Roman" w:hAnsi="Times New Roman" w:eastAsia="宋体"/>
                 <w:b/>
               </w:rPr>
               <w:t>涉及字段</w:t>
@@ -374,6 +446,9 @@
           </w:tcPr>
           <w:p>
             <w:r>
+              <w:rPr>
+                <w:rFonts w:ascii="Times New Roman" w:hAnsi="Times New Roman" w:eastAsia="宋体"/>
+              </w:rPr>
               <w:t>去重</w:t>
             </w:r>
           </w:p>
@@ -384,6 +459,9 @@
           </w:tcPr>
           <w:p>
             <w:r>
+              <w:rPr>
+                <w:rFonts w:ascii="Times New Roman" w:hAnsi="Times New Roman" w:eastAsia="宋体"/>
+              </w:rPr>
               <w:t>drop_duplicates() 删除完全重复的行</w:t>
             </w:r>
           </w:p>
@@ -394,6 +472,9 @@
           </w:tcPr>
           <w:p>
             <w:r>
+              <w:rPr>
+                <w:rFonts w:ascii="Times New Roman" w:hAnsi="Times New Roman" w:eastAsia="宋体"/>
+              </w:rPr>
               <w:t>全部字段</w:t>
             </w:r>
           </w:p>
@@ -406,6 +487,9 @@
           </w:tcPr>
           <w:p>
             <w:r>
+              <w:rPr>
+                <w:rFonts w:ascii="Times New Roman" w:hAnsi="Times New Roman" w:eastAsia="宋体"/>
+              </w:rPr>
               <w:t>缺失值填充（数值型）</w:t>
             </w:r>
           </w:p>
@@ -416,6 +500,9 @@
           </w:tcPr>
           <w:p>
             <w:r>
+              <w:rPr>
+                <w:rFonts w:ascii="Times New Roman" w:hAnsi="Times New Roman" w:eastAsia="宋体"/>
+              </w:rPr>
               <w:t>pd.to_numeric(errors='coerce') + fillna(0)</w:t>
             </w:r>
           </w:p>
@@ -426,6 +513,9 @@
           </w:tcPr>
           <w:p>
             <w:r>
+              <w:rPr>
+                <w:rFonts w:ascii="Times New Roman" w:hAnsi="Times New Roman" w:eastAsia="宋体"/>
+              </w:rPr>
               <w:t>annual_salary_usd, salary_min/max, years_of_experience, demand_score 等</w:t>
             </w:r>
           </w:p>
@@ -438,6 +528,9 @@
           </w:tcPr>
           <w:p>
             <w:r>
+              <w:rPr>
+                <w:rFonts w:ascii="Times New Roman" w:hAnsi="Times New Roman" w:eastAsia="宋体"/>
+              </w:rPr>
               <w:t>缺失值填充（分类型）</w:t>
             </w:r>
           </w:p>
@@ -448,6 +541,9 @@
           </w:tcPr>
           <w:p>
             <w:r>
+              <w:rPr>
+                <w:rFonts w:ascii="Times New Roman" w:hAnsi="Times New Roman" w:eastAsia="宋体"/>
+              </w:rPr>
               <w:t>fillna('Unknown')</w:t>
             </w:r>
           </w:p>
@@ -458,6 +554,9 @@
           </w:tcPr>
           <w:p>
             <w:r>
+              <w:rPr>
+                <w:rFonts w:ascii="Times New Roman" w:hAnsi="Times New Roman" w:eastAsia="宋体"/>
+              </w:rPr>
               <w:t>job_category, experience_level, city, country, remote_work 等</w:t>
             </w:r>
           </w:p>
@@ -470,6 +569,9 @@
           </w:tcPr>
           <w:p>
             <w:r>
+              <w:rPr>
+                <w:rFonts w:ascii="Times New Roman" w:hAnsi="Times New Roman" w:eastAsia="宋体"/>
+              </w:rPr>
               <w:t>类型转换</w:t>
             </w:r>
           </w:p>
@@ -480,6 +582,9 @@
           </w:tcPr>
           <w:p>
             <w:r>
+              <w:rPr>
+                <w:rFonts w:ascii="Times New Roman" w:hAnsi="Times New Roman" w:eastAsia="宋体"/>
+              </w:rPr>
               <w:t>.astype(int) 或 .round(2)</w:t>
             </w:r>
           </w:p>
@@ -490,6 +595,9 @@
           </w:tcPr>
           <w:p>
             <w:r>
+              <w:rPr>
+                <w:rFonts w:ascii="Times New Roman" w:hAnsi="Times New Roman" w:eastAsia="宋体"/>
+              </w:rPr>
               <w:t>薪资字段转整数，百分比字段保留两位小数</w:t>
             </w:r>
           </w:p>
@@ -502,6 +610,9 @@
           </w:tcPr>
           <w:p>
             <w:r>
+              <w:rPr>
+                <w:rFonts w:ascii="Times New Roman" w:hAnsi="Times New Roman" w:eastAsia="宋体"/>
+              </w:rPr>
               <w:t>布尔字段归一化</w:t>
             </w:r>
           </w:p>
@@ -512,6 +623,9 @@
           </w:tcPr>
           <w:p>
             <w:r>
+              <w:rPr>
+                <w:rFonts w:ascii="Times New Roman" w:hAnsi="Times New Roman" w:eastAsia="宋体"/>
+              </w:rPr>
               <w:t>fillna(0).astype(int)</w:t>
             </w:r>
           </w:p>
@@ -522,6 +636,9 @@
           </w:tcPr>
           <w:p>
             <w:r>
+              <w:rPr>
+                <w:rFonts w:ascii="Times New Roman" w:hAnsi="Times New Roman" w:eastAsia="宋体"/>
+              </w:rPr>
               <w:t>is_senior, is_remote_friendly, is_llm_role</w:t>
             </w:r>
           </w:p>
@@ -533,7 +650,10 @@
         <w:pStyle w:val="Heading2"/>
       </w:pPr>
       <w:r>
-        <w:t>2.3 智能建库与幂等性保障</w:t>
+        <w:rPr>
+          <w:rFonts w:ascii="Times New Roman" w:hAnsi="Times New Roman" w:eastAsia="宋体"/>
+        </w:rPr>
+        <w:t>2.3 智能建库、防重复 I/O 与自适应幂等性保障</w:t>
       </w:r>
     </w:p>
     <w:p>
@@ -541,7 +661,10 @@
         <w:ind w:firstLine="425"/>
       </w:pPr>
       <w:r>
-        <w:t>建库脚本 init_db.py 采用幂等性设计：每次执行前先检查目标数据库文件是否存在。若 db/ai_jobs.db 已存在，脚本会自动删除旧库并重建，确保数据一致性。这一设计使得脚本可在 Docker 容器重启、CI/CD 流水线等场景中安全重复执行，无需人工干预。</w:t>
+        <w:rPr>
+          <w:rFonts w:ascii="Times New Roman" w:hAnsi="Times New Roman" w:eastAsia="宋体"/>
+        </w:rPr>
+        <w:t>系统对关系数据库的初始化脚本 scripts/init_db.py 进行了全方位的工业级硬化设计，抛弃了传统"盲目删库重建"的高能耗、高风险方案，实现了基于状态检测的自适应增量幂等性底座。</w:t>
       </w:r>
     </w:p>
     <w:p>
@@ -549,49 +672,32 @@
         <w:ind w:firstLine="425"/>
       </w:pPr>
       <w:r>
-        <w:t>脚本核心流程：</w:t>
+        <w:rPr>
+          <w:rFonts w:ascii="Times New Roman" w:hAnsi="Times New Roman" w:eastAsia="宋体"/>
+        </w:rPr>
+        <w:t>（1）原子化状态校验：</w:t>
       </w:r>
     </w:p>
     <w:p>
       <w:pPr>
-        <w:ind w:firstLine="0" w:left="567"/>
+        <w:ind w:firstLine="425"/>
       </w:pPr>
       <w:r>
         <w:rPr>
-          <w:rFonts w:ascii="Courier New" w:hAnsi="Courier New"/>
-          <w:sz w:val="18"/>
+          <w:rFonts w:ascii="Times New Roman" w:hAnsi="Times New Roman" w:eastAsia="宋体"/>
         </w:rPr>
-        <w:t>def build_database():</w:t>
-        <w:br/>
-        <w:t xml:space="preserve">    # 1. 检查 CSV 文件是否存在</w:t>
-        <w:br/>
-        <w:t xml:space="preserve">    if not CSV_PATH.exists(): return</w:t>
-        <w:br/>
-        <w:t xml:space="preserve">    # 2. 读取并清洗数据</w:t>
-        <w:br/>
-        <w:t xml:space="preserve">    df = clean_dataframe(pd.read_csv(CSV_PATH))</w:t>
-        <w:br/>
-        <w:t xml:space="preserve">    # 3. 删除旧数据库，重建</w:t>
-        <w:br/>
-        <w:t xml:space="preserve">    if DB_PATH.exists(): DB_PATH.unlink()</w:t>
-        <w:br/>
-        <w:t xml:space="preserve">    # 4. 建表、导入、填充维度表</w:t>
-        <w:br/>
-        <w:t xml:space="preserve">    create_tables(conn)</w:t>
-        <w:br/>
-        <w:t xml:space="preserve">    df.to_sql('job_postings', conn, if_exists='append')</w:t>
-        <w:br/>
-        <w:t xml:space="preserve">    populate_dimension_tables(conn, df)</w:t>
-        <w:br/>
-        <w:t xml:space="preserve">    populate_skills(conn, df)</w:t>
+        <w:t>脚本在执行时，首先通过标准 I/O 检查 db/ai_jobs.db 物理文件是否存在。若文件存在，系统将深入校验 job_postings 核心表的数据行数，确认数据完整性。</w:t>
       </w:r>
     </w:p>
     <w:p>
       <w:pPr>
-        <w:pStyle w:val="Heading2"/>
+        <w:ind w:firstLine="425"/>
       </w:pPr>
       <w:r>
-        <w:t>2.4 预处理结果</w:t>
+        <w:rPr>
+          <w:rFonts w:ascii="Times New Roman" w:hAnsi="Times New Roman" w:eastAsia="宋体"/>
+        </w:rPr>
+        <w:t>（2）防重复写盘与自愈保护：</w:t>
       </w:r>
     </w:p>
     <w:p>
@@ -599,11 +705,39 @@
         <w:ind w:firstLine="425"/>
       </w:pPr>
       <w:r>
-        <w:t>经清洗后保留 1,500 条有效记录，所有字段缺失值已处理完毕。清洗后的数据直接通过 pandas 的 to_sql() 方法写入 SQLite 数据库，无需再生成中间 CSV 文件。</w:t>
+        <w:rPr>
+          <w:rFonts w:ascii="Times New Roman" w:hAnsi="Times New Roman" w:eastAsia="宋体"/>
+        </w:rPr>
+        <w:t>当检测到数据库已初始化且数据完备时，系统会自动终止后续的高密集型 CSV 解析与写盘操作，输出提示："Database already initialized with data. Skipping full recreation." 并安全退出。这在频繁重启开发环境或多用户并发部署时，彻底杜绝了重复 I/O 导致的磁盘磨损与数据二次污染。</w:t>
+      </w:r>
+    </w:p>
+    <w:p>
+      <w:pPr>
+        <w:ind w:firstLine="425"/>
+      </w:pPr>
+      <w:r>
+        <w:rPr>
+          <w:rFonts w:ascii="Times New Roman" w:hAnsi="Times New Roman" w:eastAsia="宋体"/>
+        </w:rPr>
+        <w:t>（3）带后门的安全覆写机制（--force）：</w:t>
+      </w:r>
+    </w:p>
+    <w:p>
+      <w:pPr>
+        <w:ind w:firstLine="425"/>
+      </w:pPr>
+      <w:r>
+        <w:rPr>
+          <w:rFonts w:ascii="Times New Roman" w:hAnsi="Times New Roman" w:eastAsia="宋体"/>
+        </w:rPr>
+        <w:t>为了同时满足"生产环境防误删"与"开发环境重洗数据"的双重需求，脚本引入了命令行参数解析器。只有当显式传入 --force 标志时，系统才会执行全量擦除重建，完美兼顾了自动化部署的安全性与调试的灵活性。</w:t>
       </w:r>
     </w:p>
     <w:p>
       <w:r>
+        <w:rPr>
+          <w:rFonts w:ascii="Times New Roman" w:hAnsi="Times New Roman" w:eastAsia="宋体"/>
+        </w:rPr>
         <w:br w:type="page"/>
       </w:r>
     </w:p>
@@ -612,6 +746,9 @@
         <w:pStyle w:val="Heading1"/>
       </w:pPr>
       <w:r>
+        <w:rPr>
+          <w:rFonts w:ascii="Times New Roman" w:hAnsi="Times New Roman" w:eastAsia="宋体"/>
+        </w:rPr>
         <w:t>三、数据库设计与建库</w:t>
       </w:r>
     </w:p>
@@ -620,6 +757,9 @@
         <w:pStyle w:val="Heading2"/>
       </w:pPr>
       <w:r>
+        <w:rPr>
+          <w:rFonts w:ascii="Times New Roman" w:hAnsi="Times New Roman" w:eastAsia="宋体"/>
+        </w:rPr>
         <w:t>3.1 数据库选型</w:t>
       </w:r>
     </w:p>
@@ -628,6 +768,9 @@
         <w:ind w:firstLine="425"/>
       </w:pPr>
       <w:r>
+        <w:rPr>
+          <w:rFonts w:ascii="Times New Roman" w:hAnsi="Times New Roman" w:eastAsia="宋体"/>
+        </w:rPr>
         <w:t>本项目选用 SQLite 作为关系数据库。SQLite 是一个轻量级的嵌入式数据库，无需独立服务器进程，数据存储在单个文件（db/ai_jobs.db）中，非常适合本规模的数据分析应用。</w:t>
       </w:r>
     </w:p>
@@ -636,6 +779,9 @@
         <w:pStyle w:val="Heading2"/>
       </w:pPr>
       <w:r>
+        <w:rPr>
+          <w:rFonts w:ascii="Times New Roman" w:hAnsi="Times New Roman" w:eastAsia="宋体"/>
+        </w:rPr>
         <w:t>3.2 表结构设计</w:t>
       </w:r>
     </w:p>
@@ -644,6 +790,9 @@
         <w:ind w:firstLine="425"/>
       </w:pPr>
       <w:r>
+        <w:rPr>
+          <w:rFonts w:ascii="Times New Roman" w:hAnsi="Times New Roman" w:eastAsia="宋体"/>
+        </w:rPr>
         <w:t>数据库包含 5 张表，采用星型模型设计，以 job_postings 为核心事实表：</w:t>
       </w:r>
     </w:p>
@@ -671,6 +820,7 @@
             </w:pPr>
             <w:r>
               <w:rPr>
+                <w:rFonts w:ascii="Times New Roman" w:hAnsi="Times New Roman" w:eastAsia="宋体"/>
                 <w:b/>
               </w:rPr>
               <w:t>表名</w:t>
@@ -687,6 +837,7 @@
             </w:pPr>
             <w:r>
               <w:rPr>
+                <w:rFonts w:ascii="Times New Roman" w:hAnsi="Times New Roman" w:eastAsia="宋体"/>
                 <w:b/>
               </w:rPr>
               <w:t>行数</w:t>
@@ -703,6 +854,7 @@
             </w:pPr>
             <w:r>
               <w:rPr>
+                <w:rFonts w:ascii="Times New Roman" w:hAnsi="Times New Roman" w:eastAsia="宋体"/>
                 <w:b/>
               </w:rPr>
               <w:t>说明</w:t>
@@ -719,6 +871,7 @@
             </w:pPr>
             <w:r>
               <w:rPr>
+                <w:rFonts w:ascii="Times New Roman" w:hAnsi="Times New Roman" w:eastAsia="宋体"/>
                 <w:b/>
               </w:rPr>
               <w:t>关键字段</w:t>
@@ -733,6 +886,9 @@
           </w:tcPr>
           <w:p>
             <w:r>
+              <w:rPr>
+                <w:rFonts w:ascii="Times New Roman" w:hAnsi="Times New Roman" w:eastAsia="宋体"/>
+              </w:rPr>
               <w:t>job_postings</w:t>
             </w:r>
           </w:p>
@@ -743,6 +899,9 @@
           </w:tcPr>
           <w:p>
             <w:r>
+              <w:rPr>
+                <w:rFonts w:ascii="Times New Roman" w:hAnsi="Times New Roman" w:eastAsia="宋体"/>
+              </w:rPr>
               <w:t>1,500</w:t>
             </w:r>
           </w:p>
@@ -753,6 +912,9 @@
           </w:tcPr>
           <w:p>
             <w:r>
+              <w:rPr>
+                <w:rFonts w:ascii="Times New Roman" w:hAnsi="Times New Roman" w:eastAsia="宋体"/>
+              </w:rPr>
               <w:t>核心事实表：岗位信息</w:t>
             </w:r>
           </w:p>
@@ -763,6 +925,9 @@
           </w:tcPr>
           <w:p>
             <w:r>
+              <w:rPr>
+                <w:rFonts w:ascii="Times New Roman" w:hAnsi="Times New Roman" w:eastAsia="宋体"/>
+              </w:rPr>
               <w:t>job_id(PK), job_title, annual_salary_usd, required_skills</w:t>
             </w:r>
           </w:p>
@@ -775,6 +940,9 @@
           </w:tcPr>
           <w:p>
             <w:r>
+              <w:rPr>
+                <w:rFonts w:ascii="Times New Roman" w:hAnsi="Times New Roman" w:eastAsia="宋体"/>
+              </w:rPr>
               <w:t>job_skills</w:t>
             </w:r>
           </w:p>
@@ -785,6 +953,9 @@
           </w:tcPr>
           <w:p>
             <w:r>
+              <w:rPr>
+                <w:rFonts w:ascii="Times New Roman" w:hAnsi="Times New Roman" w:eastAsia="宋体"/>
+              </w:rPr>
               <w:t>9,548</w:t>
             </w:r>
           </w:p>
@@ -795,6 +966,9 @@
           </w:tcPr>
           <w:p>
             <w:r>
+              <w:rPr>
+                <w:rFonts w:ascii="Times New Roman" w:hAnsi="Times New Roman" w:eastAsia="宋体"/>
+              </w:rPr>
               <w:t>技能维度表：每行一个技能</w:t>
             </w:r>
           </w:p>
@@ -805,6 +979,9 @@
           </w:tcPr>
           <w:p>
             <w:r>
+              <w:rPr>
+                <w:rFonts w:ascii="Times New Roman" w:hAnsi="Times New Roman" w:eastAsia="宋体"/>
+              </w:rPr>
               <w:t>id(PK), job_id(FK), skill</w:t>
             </w:r>
           </w:p>
@@ -817,6 +994,9 @@
           </w:tcPr>
           <w:p>
             <w:r>
+              <w:rPr>
+                <w:rFonts w:ascii="Times New Roman" w:hAnsi="Times New Roman" w:eastAsia="宋体"/>
+              </w:rPr>
               <w:t>job_categories</w:t>
             </w:r>
           </w:p>
@@ -827,6 +1007,9 @@
           </w:tcPr>
           <w:p>
             <w:r>
+              <w:rPr>
+                <w:rFonts w:ascii="Times New Roman" w:hAnsi="Times New Roman" w:eastAsia="宋体"/>
+              </w:rPr>
               <w:t>12</w:t>
             </w:r>
           </w:p>
@@ -837,6 +1020,9 @@
           </w:tcPr>
           <w:p>
             <w:r>
+              <w:rPr>
+                <w:rFonts w:ascii="Times New Roman" w:hAnsi="Times New Roman" w:eastAsia="宋体"/>
+              </w:rPr>
               <w:t>类别汇总表</w:t>
             </w:r>
           </w:p>
@@ -847,6 +1033,9 @@
           </w:tcPr>
           <w:p>
             <w:r>
+              <w:rPr>
+                <w:rFonts w:ascii="Times New Roman" w:hAnsi="Times New Roman" w:eastAsia="宋体"/>
+              </w:rPr>
               <w:t>category(PK), job_count, avg_salary</w:t>
             </w:r>
           </w:p>
@@ -859,6 +1048,9 @@
           </w:tcPr>
           <w:p>
             <w:r>
+              <w:rPr>
+                <w:rFonts w:ascii="Times New Roman" w:hAnsi="Times New Roman" w:eastAsia="宋体"/>
+              </w:rPr>
               <w:t>experience_levels</w:t>
             </w:r>
           </w:p>
@@ -869,6 +1061,9 @@
           </w:tcPr>
           <w:p>
             <w:r>
+              <w:rPr>
+                <w:rFonts w:ascii="Times New Roman" w:hAnsi="Times New Roman" w:eastAsia="宋体"/>
+              </w:rPr>
               <w:t>4</w:t>
             </w:r>
           </w:p>
@@ -879,6 +1074,9 @@
           </w:tcPr>
           <w:p>
             <w:r>
+              <w:rPr>
+                <w:rFonts w:ascii="Times New Roman" w:hAnsi="Times New Roman" w:eastAsia="宋体"/>
+              </w:rPr>
               <w:t>经验汇总表</w:t>
             </w:r>
           </w:p>
@@ -889,6 +1087,9 @@
           </w:tcPr>
           <w:p>
             <w:r>
+              <w:rPr>
+                <w:rFonts w:ascii="Times New Roman" w:hAnsi="Times New Roman" w:eastAsia="宋体"/>
+              </w:rPr>
               <w:t>level(PK), job_count, avg_salary</w:t>
             </w:r>
           </w:p>
@@ -901,6 +1102,9 @@
           </w:tcPr>
           <w:p>
             <w:r>
+              <w:rPr>
+                <w:rFonts w:ascii="Times New Roman" w:hAnsi="Times New Roman" w:eastAsia="宋体"/>
+              </w:rPr>
               <w:t>location_summary</w:t>
             </w:r>
           </w:p>
@@ -911,6 +1115,9 @@
           </w:tcPr>
           <w:p>
             <w:r>
+              <w:rPr>
+                <w:rFonts w:ascii="Times New Roman" w:hAnsi="Times New Roman" w:eastAsia="宋体"/>
+              </w:rPr>
               <w:t>20</w:t>
             </w:r>
           </w:p>
@@ -921,6 +1128,9 @@
           </w:tcPr>
           <w:p>
             <w:r>
+              <w:rPr>
+                <w:rFonts w:ascii="Times New Roman" w:hAnsi="Times New Roman" w:eastAsia="宋体"/>
+              </w:rPr>
               <w:t>地点汇总表</w:t>
             </w:r>
           </w:p>
@@ -931,6 +1141,9 @@
           </w:tcPr>
           <w:p>
             <w:r>
+              <w:rPr>
+                <w:rFonts w:ascii="Times New Roman" w:hAnsi="Times New Roman" w:eastAsia="宋体"/>
+              </w:rPr>
               <w:t>country, city, job_count, avg_salary</w:t>
             </w:r>
           </w:p>
@@ -942,6 +1155,9 @@
         <w:pStyle w:val="Heading2"/>
       </w:pPr>
       <w:r>
+        <w:rPr>
+          <w:rFonts w:ascii="Times New Roman" w:hAnsi="Times New Roman" w:eastAsia="宋体"/>
+        </w:rPr>
         <w:t>3.3 索引设计</w:t>
       </w:r>
     </w:p>
@@ -950,6 +1166,9 @@
         <w:ind w:firstLine="425"/>
       </w:pPr>
       <w:r>
+        <w:rPr>
+          <w:rFonts w:ascii="Times New Roman" w:hAnsi="Times New Roman" w:eastAsia="宋体"/>
+        </w:rPr>
         <w:t>为加速常用查询，为以下字段建立了索引：</w:t>
       </w:r>
     </w:p>
@@ -958,6 +1177,9 @@
         <w:pStyle w:val="ListBullet"/>
       </w:pPr>
       <w:r>
+        <w:rPr>
+          <w:rFonts w:ascii="Times New Roman" w:hAnsi="Times New Roman" w:eastAsia="宋体"/>
+        </w:rPr>
         <w:t>idx_postings_category — 按岗位类别查询</w:t>
       </w:r>
     </w:p>
@@ -966,6 +1188,9 @@
         <w:pStyle w:val="ListBullet"/>
       </w:pPr>
       <w:r>
+        <w:rPr>
+          <w:rFonts w:ascii="Times New Roman" w:hAnsi="Times New Roman" w:eastAsia="宋体"/>
+        </w:rPr>
         <w:t>idx_postings_country — 按国家/地区查询</w:t>
       </w:r>
     </w:p>
@@ -974,6 +1199,9 @@
         <w:pStyle w:val="ListBullet"/>
       </w:pPr>
       <w:r>
+        <w:rPr>
+          <w:rFonts w:ascii="Times New Roman" w:hAnsi="Times New Roman" w:eastAsia="宋体"/>
+        </w:rPr>
         <w:t>idx_postings_remote — 按远程工作状态查询</w:t>
       </w:r>
     </w:p>
@@ -982,6 +1210,9 @@
         <w:pStyle w:val="ListBullet"/>
       </w:pPr>
       <w:r>
+        <w:rPr>
+          <w:rFonts w:ascii="Times New Roman" w:hAnsi="Times New Roman" w:eastAsia="宋体"/>
+        </w:rPr>
         <w:t>idx_postings_salary — 按薪资范围查询</w:t>
       </w:r>
     </w:p>
@@ -990,6 +1221,9 @@
         <w:pStyle w:val="ListBullet"/>
       </w:pPr>
       <w:r>
+        <w:rPr>
+          <w:rFonts w:ascii="Times New Roman" w:hAnsi="Times New Roman" w:eastAsia="宋体"/>
+        </w:rPr>
         <w:t>idx_postings_experience — 按经验级别查询</w:t>
       </w:r>
     </w:p>
@@ -998,6 +1232,9 @@
         <w:pStyle w:val="ListBullet"/>
       </w:pPr>
       <w:r>
+        <w:rPr>
+          <w:rFonts w:ascii="Times New Roman" w:hAnsi="Times New Roman" w:eastAsia="宋体"/>
+        </w:rPr>
         <w:t>idx_skills_job — 按 job_id 关联技能表</w:t>
       </w:r>
     </w:p>
@@ -1006,6 +1243,9 @@
         <w:pStyle w:val="ListBullet"/>
       </w:pPr>
       <w:r>
+        <w:rPr>
+          <w:rFonts w:ascii="Times New Roman" w:hAnsi="Times New Roman" w:eastAsia="宋体"/>
+        </w:rPr>
         <w:t>idx_skills_skill — 按技能名称搜索</w:t>
       </w:r>
     </w:p>
@@ -1014,6 +1254,9 @@
         <w:pStyle w:val="Heading2"/>
       </w:pPr>
       <w:r>
+        <w:rPr>
+          <w:rFonts w:ascii="Times New Roman" w:hAnsi="Times New Roman" w:eastAsia="宋体"/>
+        </w:rPr>
         <w:t>3.4 建库脚本</w:t>
       </w:r>
     </w:p>
@@ -1022,6 +1265,9 @@
         <w:ind w:firstLine="425"/>
       </w:pPr>
       <w:r>
+        <w:rPr>
+          <w:rFonts w:ascii="Times New Roman" w:hAnsi="Times New Roman" w:eastAsia="宋体"/>
+        </w:rPr>
         <w:t>建库脚本为 scripts/init_db.py，运行命令：python3 scripts/init_db.py。该脚本会读取 CSV 文件，执行数据清洗，创建表结构和索引，导入数据，并打印统计信息以验证导入成功。</w:t>
       </w:r>
     </w:p>
@@ -1030,6 +1276,9 @@
         <w:ind w:firstLine="425"/>
       </w:pPr>
       <w:r>
+        <w:rPr>
+          <w:rFonts w:ascii="Times New Roman" w:hAnsi="Times New Roman" w:eastAsia="宋体"/>
+        </w:rPr>
         <w:t>脚本执行完毕后的验证输出：</w:t>
       </w:r>
     </w:p>
@@ -1039,7 +1288,7 @@
       </w:pPr>
       <w:r>
         <w:rPr>
-          <w:rFonts w:ascii="Courier New" w:hAnsi="Courier New"/>
+          <w:rFonts w:ascii="Times New Roman" w:hAnsi="Times New Roman" w:eastAsia="宋体"/>
           <w:sz w:val="18"/>
         </w:rPr>
         <w:t>==================================================</w:t>
@@ -1057,6 +1306,9 @@
     </w:p>
     <w:p>
       <w:r>
+        <w:rPr>
+          <w:rFonts w:ascii="Times New Roman" w:hAnsi="Times New Roman" w:eastAsia="宋体"/>
+        </w:rPr>
         <w:br w:type="page"/>
       </w:r>
     </w:p>
@@ -1065,6 +1317,9 @@
         <w:pStyle w:val="Heading1"/>
       </w:pPr>
       <w:r>
+        <w:rPr>
+          <w:rFonts w:ascii="Times New Roman" w:hAnsi="Times New Roman" w:eastAsia="宋体"/>
+        </w:rPr>
         <w:t>四、数据智能体设计与实现</w:t>
       </w:r>
     </w:p>
@@ -1073,6 +1328,9 @@
         <w:pStyle w:val="Heading2"/>
       </w:pPr>
       <w:r>
+        <w:rPr>
+          <w:rFonts w:ascii="Times New Roman" w:hAnsi="Times New Roman" w:eastAsia="宋体"/>
+        </w:rPr>
         <w:t>4.1 系统架构</w:t>
       </w:r>
     </w:p>
@@ -1081,6 +1339,9 @@
         <w:ind w:firstLine="425"/>
       </w:pPr>
       <w:r>
+        <w:rPr>
+          <w:rFonts w:ascii="Times New Roman" w:hAnsi="Times New Roman" w:eastAsia="宋体"/>
+        </w:rPr>
         <w:t>系统采用 Streamlit + LangChain + LLM + SQLite 的四层架构：</w:t>
       </w:r>
     </w:p>
@@ -1090,7 +1351,7 @@
       </w:pPr>
       <w:r>
         <w:rPr>
-          <w:rFonts w:ascii="Courier New" w:hAnsi="Courier New"/>
+          <w:rFonts w:ascii="Times New Roman" w:hAnsi="Times New Roman" w:eastAsia="宋体"/>
           <w:sz w:val="18"/>
         </w:rPr>
         <w:t>用户问题 --&gt; Streamlit Web UI --&gt; LangChain 调用 LLM 生成 SQL</w:t>
@@ -1103,6 +1364,9 @@
         <w:pStyle w:val="Heading2"/>
       </w:pPr>
       <w:r>
+        <w:rPr>
+          <w:rFonts w:ascii="Times New Roman" w:hAnsi="Times New Roman" w:eastAsia="宋体"/>
+        </w:rPr>
         <w:t>4.2 模块化架构：中心化工具层设计</w:t>
       </w:r>
     </w:p>
@@ -1111,6 +1375,9 @@
         <w:ind w:firstLine="425"/>
       </w:pPr>
       <w:r>
+        <w:rPr>
+          <w:rFonts w:ascii="Times New Roman" w:hAnsi="Times New Roman" w:eastAsia="宋体"/>
+        </w:rPr>
         <w:t>在项目初期，app.py（Web UI）和 scripts/data_agent.py（CLI Agent）各自维护了一套几乎完全相同的 LLM 调用、SQL 解析和结果总结函数，导致约 80 行代码完全重复。任何对 SQL 生成规则或 LLM 配置的修改都必须同步到两个文件，极易遗漏引发线上不一致。</w:t>
       </w:r>
     </w:p>
@@ -1119,6 +1386,9 @@
         <w:ind w:firstLine="425"/>
       </w:pPr>
       <w:r>
+        <w:rPr>
+          <w:rFonts w:ascii="Times New Roman" w:hAnsi="Times New Roman" w:eastAsia="宋体"/>
+        </w:rPr>
         <w:t>为解决这一架构缺陷，我们实施了中心化工具层重构：将所有共享函数抽取到 scripts/llm_utils.py 中，作为整个系统唯一的 LLM/SQL 逻辑真实来源（Single Source of Truth）。重构后，app.py 和 data_agent.py 均通过 from scripts.llm_utils import ... 导入所需函数，代码重复率降低约 50%。</w:t>
       </w:r>
     </w:p>
@@ -1127,6 +1397,9 @@
         <w:ind w:firstLine="425"/>
       </w:pPr>
       <w:r>
+        <w:rPr>
+          <w:rFonts w:ascii="Times New Roman" w:hAnsi="Times New Roman" w:eastAsia="宋体"/>
+        </w:rPr>
         <w:t>重构后的模块职责划分如下：</w:t>
       </w:r>
     </w:p>
@@ -1153,6 +1426,7 @@
             </w:pPr>
             <w:r>
               <w:rPr>
+                <w:rFonts w:ascii="Times New Roman" w:hAnsi="Times New Roman" w:eastAsia="宋体"/>
                 <w:b/>
               </w:rPr>
               <w:t>模块</w:t>
@@ -1169,6 +1443,7 @@
             </w:pPr>
             <w:r>
               <w:rPr>
+                <w:rFonts w:ascii="Times New Roman" w:hAnsi="Times New Roman" w:eastAsia="宋体"/>
                 <w:b/>
               </w:rPr>
               <w:t>职责</w:t>
@@ -1185,6 +1460,7 @@
             </w:pPr>
             <w:r>
               <w:rPr>
+                <w:rFonts w:ascii="Times New Roman" w:hAnsi="Times New Roman" w:eastAsia="宋体"/>
                 <w:b/>
               </w:rPr>
               <w:t>依赖关系</w:t>
@@ -1199,6 +1475,9 @@
           </w:tcPr>
           <w:p>
             <w:r>
+              <w:rPr>
+                <w:rFonts w:ascii="Times New Roman" w:hAnsi="Times New Roman" w:eastAsia="宋体"/>
+              </w:rPr>
               <w:t>scripts/llm_utils.py</w:t>
             </w:r>
           </w:p>
@@ -1209,6 +1488,9 @@
           </w:tcPr>
           <w:p>
             <w:r>
+              <w:rPr>
+                <w:rFonts w:ascii="Times New Roman" w:hAnsi="Times New Roman" w:eastAsia="宋体"/>
+              </w:rPr>
               <w:t>中心化工具层：LLM 初始化、SQL 提取、防幻觉解析、结果总结</w:t>
             </w:r>
           </w:p>
@@ -1219,6 +1501,9 @@
           </w:tcPr>
           <w:p>
             <w:r>
+              <w:rPr>
+                <w:rFonts w:ascii="Times New Roman" w:hAnsi="Times New Roman" w:eastAsia="宋体"/>
+              </w:rPr>
               <w:t>被 app.py 和 data_agent.py 共同依赖</w:t>
             </w:r>
           </w:p>
@@ -1231,6 +1516,9 @@
           </w:tcPr>
           <w:p>
             <w:r>
+              <w:rPr>
+                <w:rFonts w:ascii="Times New Roman" w:hAnsi="Times New Roman" w:eastAsia="宋体"/>
+              </w:rPr>
               <w:t>app.py</w:t>
             </w:r>
           </w:p>
@@ -1241,6 +1529,9 @@
           </w:tcPr>
           <w:p>
             <w:r>
+              <w:rPr>
+                <w:rFonts w:ascii="Times New Roman" w:hAnsi="Times New Roman" w:eastAsia="宋体"/>
+              </w:rPr>
               <w:t>Streamlit Web UI：三个标签页（Smart Query / Data Browser / Preset Analysis）</w:t>
             </w:r>
           </w:p>
@@ -1251,6 +1542,9 @@
           </w:tcPr>
           <w:p>
             <w:r>
+              <w:rPr>
+                <w:rFonts w:ascii="Times New Roman" w:hAnsi="Times New Roman" w:eastAsia="宋体"/>
+              </w:rPr>
               <w:t>从 llm_utils.py 导入 get_llm、generate_sql_with_llm、summarize_with_llm</w:t>
             </w:r>
           </w:p>
@@ -1263,6 +1557,9 @@
           </w:tcPr>
           <w:p>
             <w:r>
+              <w:rPr>
+                <w:rFonts w:ascii="Times New Roman" w:hAnsi="Times New Roman" w:eastAsia="宋体"/>
+              </w:rPr>
               <w:t>scripts/data_agent.py</w:t>
             </w:r>
           </w:p>
@@ -1273,6 +1570,9 @@
           </w:tcPr>
           <w:p>
             <w:r>
+              <w:rPr>
+                <w:rFonts w:ascii="Times New Roman" w:hAnsi="Times New Roman" w:eastAsia="宋体"/>
+              </w:rPr>
               <w:t>CLI Agent：交互式和单次查询两种模式</w:t>
             </w:r>
           </w:p>
@@ -1283,6 +1583,9 @@
           </w:tcPr>
           <w:p>
             <w:r>
+              <w:rPr>
+                <w:rFonts w:ascii="Times New Roman" w:hAnsi="Times New Roman" w:eastAsia="宋体"/>
+              </w:rPr>
               <w:t>从 llm_utils.py 导入全部 5 个核心函数</w:t>
             </w:r>
           </w:p>
@@ -1295,6 +1598,9 @@
           </w:tcPr>
           <w:p>
             <w:r>
+              <w:rPr>
+                <w:rFonts w:ascii="Times New Roman" w:hAnsi="Times New Roman" w:eastAsia="宋体"/>
+              </w:rPr>
               <w:t>scripts/init_db.py</w:t>
             </w:r>
           </w:p>
@@ -1305,6 +1611,9 @@
           </w:tcPr>
           <w:p>
             <w:r>
+              <w:rPr>
+                <w:rFonts w:ascii="Times New Roman" w:hAnsi="Times New Roman" w:eastAsia="宋体"/>
+              </w:rPr>
               <w:t>数据导入与建库脚本</w:t>
             </w:r>
           </w:p>
@@ -1315,6 +1624,9 @@
           </w:tcPr>
           <w:p>
             <w:r>
+              <w:rPr>
+                <w:rFonts w:ascii="Times New Roman" w:hAnsi="Times New Roman" w:eastAsia="宋体"/>
+              </w:rPr>
               <w:t>独立运行，无 LLM 依赖</w:t>
             </w:r>
           </w:p>
@@ -1326,6 +1638,9 @@
         <w:ind w:firstLine="425"/>
       </w:pPr>
       <w:r>
+        <w:rPr>
+          <w:rFonts w:ascii="Times New Roman" w:hAnsi="Times New Roman" w:eastAsia="宋体"/>
+        </w:rPr>
         <w:t>以下为 scripts/llm_utils.py 中定义的核心共享函数：</w:t>
       </w:r>
     </w:p>
@@ -1335,7 +1650,7 @@
       </w:pPr>
       <w:r>
         <w:rPr>
-          <w:rFonts w:ascii="Courier New" w:hAnsi="Courier New"/>
+          <w:rFonts w:ascii="Times New Roman" w:hAnsi="Times New Roman" w:eastAsia="宋体"/>
           <w:sz w:val="18"/>
         </w:rPr>
         <w:t># scripts/llm_utils.py 核心函数清单</w:t>
@@ -1358,6 +1673,9 @@
         <w:pStyle w:val="Heading2"/>
       </w:pPr>
       <w:r>
+        <w:rPr>
+          <w:rFonts w:ascii="Times New Roman" w:hAnsi="Times New Roman" w:eastAsia="宋体"/>
+        </w:rPr>
         <w:t>4.3 LangChain 集成</w:t>
       </w:r>
     </w:p>
@@ -1366,6 +1684,9 @@
         <w:ind w:firstLine="425"/>
       </w:pPr>
       <w:r>
+        <w:rPr>
+          <w:rFonts w:ascii="Times New Roman" w:hAnsi="Times New Roman" w:eastAsia="宋体"/>
+        </w:rPr>
         <w:t>本项目使用 LangChain 的 ChatOpenAI 接口连接 DeepSeek API。由于 DeepSeek API 兼容 OpenAI SDK 格式，只需将 base_url 指向 DeepSeek 的 API 地址即可。配置如下：</w:t>
       </w:r>
     </w:p>
@@ -1375,7 +1696,7 @@
       </w:pPr>
       <w:r>
         <w:rPr>
-          <w:rFonts w:ascii="Courier New" w:hAnsi="Courier New"/>
+          <w:rFonts w:ascii="Times New Roman" w:hAnsi="Times New Roman" w:eastAsia="宋体"/>
           <w:sz w:val="18"/>
         </w:rPr>
         <w:t>ChatOpenAI(</w:t>
@@ -1398,6 +1719,9 @@
         <w:pStyle w:val="Heading2"/>
       </w:pPr>
       <w:r>
+        <w:rPr>
+          <w:rFonts w:ascii="Times New Roman" w:hAnsi="Times New Roman" w:eastAsia="宋体"/>
+        </w:rPr>
         <w:t>4.4 SQL 生成流程</w:t>
       </w:r>
     </w:p>
@@ -1406,26 +1730,41 @@
         <w:ind w:firstLine="425"/>
       </w:pPr>
       <w:r>
+        <w:rPr>
+          <w:rFonts w:ascii="Times New Roman" w:hAnsi="Times New Roman" w:eastAsia="宋体"/>
+        </w:rPr>
         <w:t>LLM 生成 SQL 的过程如下：</w:t>
       </w:r>
     </w:p>
     <w:p>
       <w:r>
+        <w:rPr>
+          <w:rFonts w:ascii="Times New Roman" w:hAnsi="Times New Roman" w:eastAsia="宋体"/>
+        </w:rPr>
         <w:t>1. 系统提示词（SystemMessage）包含数据库表结构描述（SCHEMA_HINT）和 SQL 生成规则（SQL_RULES）</w:t>
       </w:r>
     </w:p>
     <w:p>
       <w:r>
+        <w:rPr>
+          <w:rFonts w:ascii="Times New Roman" w:hAnsi="Times New Roman" w:eastAsia="宋体"/>
+        </w:rPr>
         <w:t>2. 用户问题作为 HumanMessage 发送给 LLM</w:t>
       </w:r>
     </w:p>
     <w:p>
       <w:r>
+        <w:rPr>
+          <w:rFonts w:ascii="Times New Roman" w:hAnsi="Times New Roman" w:eastAsia="宋体"/>
+        </w:rPr>
         <w:t>3. LLM 返回的原始文本经过 extract_sql() 函数处理：清除 think 标签、提取代码块、去除注释、截断超长 OR 链</w:t>
       </w:r>
     </w:p>
     <w:p>
       <w:r>
+        <w:rPr>
+          <w:rFonts w:ascii="Times New Roman" w:hAnsi="Times New Roman" w:eastAsia="宋体"/>
+        </w:rPr>
         <w:t>4. 处理后的 SQL 在 SQLite 中执行，最多重试 3 次（每次将错误信息反馈给 LLM）</w:t>
       </w:r>
     </w:p>
@@ -1434,6 +1773,9 @@
         <w:pStyle w:val="Heading2"/>
       </w:pPr>
       <w:r>
+        <w:rPr>
+          <w:rFonts w:ascii="Times New Roman" w:hAnsi="Times New Roman" w:eastAsia="宋体"/>
+        </w:rPr>
         <w:t>4.5 双层语义防火墙与运行时沙箱机制</w:t>
       </w:r>
     </w:p>
@@ -1442,6 +1784,9 @@
         <w:ind w:firstLine="425"/>
       </w:pPr>
       <w:r>
+        <w:rPr>
+          <w:rFonts w:ascii="Times New Roman" w:hAnsi="Times New Roman" w:eastAsia="宋体"/>
+        </w:rPr>
         <w:t>为防止 LLM 生成危险或无效的 SQL，系统设计了双层防护架构。第一层为语义层防火墙，通过精心设计的提示词约束和后处理逻辑，在 LLM 输出阶段拦截问题 SQL；第二层为运行时沙箱，在 SQL 实际执行前进行关键字黑名单扫描，确保即使绕过第一层防护的破坏性语句也无法到达数据库引擎。</w:t>
       </w:r>
     </w:p>
@@ -1450,6 +1795,9 @@
         <w:pStyle w:val="Heading3"/>
       </w:pPr>
       <w:r>
+        <w:rPr>
+          <w:rFonts w:ascii="Times New Roman" w:hAnsi="Times New Roman" w:eastAsia="宋体"/>
+        </w:rPr>
         <w:t>4.5.1 第一层：语义层防火墙</w:t>
       </w:r>
     </w:p>
@@ -1458,6 +1806,9 @@
         <w:ind w:firstLine="425"/>
       </w:pPr>
       <w:r>
+        <w:rPr>
+          <w:rFonts w:ascii="Times New Roman" w:hAnsi="Times New Roman" w:eastAsia="宋体"/>
+        </w:rPr>
         <w:t>在 LLM 输出解析阶段（extract_sql 函数），实施以下防护措施：</w:t>
       </w:r>
     </w:p>
@@ -1466,6 +1817,9 @@
         <w:pStyle w:val="ListBullet"/>
       </w:pPr>
       <w:r>
+        <w:rPr>
+          <w:rFonts w:ascii="Times New Roman" w:hAnsi="Times New Roman" w:eastAsia="宋体"/>
+        </w:rPr>
         <w:t>提示词约束：SQL_RULES 明确要求只生成 SELECT 查询，禁止 CREATE/DROP/ALTER/INSERT/UPDATE/DELETE</w:t>
       </w:r>
     </w:p>
@@ -1474,6 +1828,9 @@
         <w:pStyle w:val="ListBullet"/>
       </w:pPr>
       <w:r>
+        <w:rPr>
+          <w:rFonts w:ascii="Times New Roman" w:hAnsi="Times New Roman" w:eastAsia="宋体"/>
+        </w:rPr>
         <w:t>OR 链截断：超过 10 个 OR 条件时自动截断，防止 LLM 编造大量不存在的值导致全表扫描</w:t>
       </w:r>
     </w:p>
@@ -1482,6 +1839,9 @@
         <w:pStyle w:val="ListBullet"/>
       </w:pPr>
       <w:r>
+        <w:rPr>
+          <w:rFonts w:ascii="Times New Roman" w:hAnsi="Times New Roman" w:eastAsia="宋体"/>
+        </w:rPr>
         <w:t>SQL 长度限制：最长 1500 字符，超出部分直接截断，防止 LLM 生成超长恶意查询</w:t>
       </w:r>
     </w:p>
@@ -1490,6 +1850,9 @@
         <w:pStyle w:val="ListBullet"/>
       </w:pPr>
       <w:r>
+        <w:rPr>
+          <w:rFonts w:ascii="Times New Roman" w:hAnsi="Times New Roman" w:eastAsia="宋体"/>
+        </w:rPr>
         <w:t>Markdown 清除：自动去除 LLM 输出中的代码块标记、注释和 think 标签</w:t>
       </w:r>
     </w:p>
@@ -1498,6 +1861,9 @@
         <w:pStyle w:val="ListBullet"/>
       </w:pPr>
       <w:r>
+        <w:rPr>
+          <w:rFonts w:ascii="Times New Roman" w:hAnsi="Times New Roman" w:eastAsia="宋体"/>
+        </w:rPr>
         <w:t>温度设为 0：确保 LLM 输出的确定性和一致性</w:t>
       </w:r>
     </w:p>
@@ -1506,6 +1872,9 @@
         <w:pStyle w:val="ListBullet"/>
       </w:pPr>
       <w:r>
+        <w:rPr>
+          <w:rFonts w:ascii="Times New Roman" w:hAnsi="Times New Roman" w:eastAsia="宋体"/>
+        </w:rPr>
         <w:t>趋势查询强制分组：当用户询问趋势或对比类问题时，提示词强制要求使用 GROUP BY 按时间或分类维度拆分，避免返回单行聚合结果</w:t>
       </w:r>
     </w:p>
@@ -1514,6 +1883,9 @@
         <w:pStyle w:val="Heading3"/>
       </w:pPr>
       <w:r>
+        <w:rPr>
+          <w:rFonts w:ascii="Times New Roman" w:hAnsi="Times New Roman" w:eastAsia="宋体"/>
+        </w:rPr>
         <w:t>4.5.2 第二层：运行时 SQL 关键字拦截</w:t>
       </w:r>
     </w:p>
@@ -1522,6 +1894,9 @@
         <w:ind w:firstLine="425"/>
       </w:pPr>
       <w:r>
+        <w:rPr>
+          <w:rFonts w:ascii="Times New Roman" w:hAnsi="Times New Roman" w:eastAsia="宋体"/>
+        </w:rPr>
         <w:t>在 SQL 实际执行前，系统对 LLM 生成的 SQL 语句进行二次扫描。通过硬编码的关键字黑名单列表，拦截所有可能造成数据破坏的 DDL 和 DML 操作。黑名单包含以下高危关键字：</w:t>
       </w:r>
     </w:p>
@@ -1531,7 +1906,7 @@
       </w:pPr>
       <w:r>
         <w:rPr>
-          <w:rFonts w:ascii="Courier New" w:hAnsi="Courier New"/>
+          <w:rFonts w:ascii="Times New Roman" w:hAnsi="Times New Roman" w:eastAsia="宋体"/>
           <w:sz w:val="18"/>
         </w:rPr>
         <w:t>SQL_KEYWORD_BLACKLIST = [</w:t>
@@ -1548,6 +1923,9 @@
         <w:ind w:firstLine="425"/>
       </w:pPr>
       <w:r>
+        <w:rPr>
+          <w:rFonts w:ascii="Times New Roman" w:hAnsi="Times New Roman" w:eastAsia="宋体"/>
+        </w:rPr>
         <w:t>拦截逻辑在 execute_sql 函数执行前触发：若 SQL 语句中包含黑名单中的任一关键字（不区分大小写），系统立即拒绝执行并返回安全警告，确保数据库不会受到任何写入或结构修改操作的影响。这一机制构成了系统的运行时安全沙箱，即使 LLM 因提示注入或模型幻觉生成了破坏性语句，也无法绕过该层防护。</w:t>
       </w:r>
     </w:p>
@@ -1556,6 +1934,9 @@
         <w:pStyle w:val="Heading2"/>
       </w:pPr>
       <w:r>
+        <w:rPr>
+          <w:rFonts w:ascii="Times New Roman" w:hAnsi="Times New Roman" w:eastAsia="宋体"/>
+        </w:rPr>
         <w:t>4.6 错误自修复与重试机制</w:t>
       </w:r>
     </w:p>
@@ -1564,6 +1945,9 @@
         <w:ind w:firstLine="425"/>
       </w:pPr>
       <w:r>
+        <w:rPr>
+          <w:rFonts w:ascii="Times New Roman" w:hAnsi="Times New Roman" w:eastAsia="宋体"/>
+        </w:rPr>
         <w:t>当 LLM 生成的 SQL 在 SQLite 中执行失败时，系统不会直接报错终止，而是将错误信息（如表名不存在、列名拼写错误、语法错误等）反馈给 LLM，要求其生成一个修正后的 SQL 查询。该重试机制最多执行 3 次，每次重试时系统提示词中会追加如下错误上下文：</w:t>
       </w:r>
     </w:p>
@@ -1573,7 +1957,7 @@
       </w:pPr>
       <w:r>
         <w:rPr>
-          <w:rFonts w:ascii="Courier New" w:hAnsi="Courier New"/>
+          <w:rFonts w:ascii="Times New Roman" w:hAnsi="Times New Roman" w:eastAsia="宋体"/>
           <w:sz w:val="18"/>
         </w:rPr>
         <w:t>Previous SQL failed: {错误信息}</w:t>
@@ -1586,11 +1970,17 @@
         <w:ind w:firstLine="425"/>
       </w:pPr>
       <w:r>
+        <w:rPr>
+          <w:rFonts w:ascii="Times New Roman" w:hAnsi="Times New Roman" w:eastAsia="宋体"/>
+        </w:rPr>
         <w:t>这一设计使得系统能够自动修复常见的 LLM 幻觉问题（如编造不存在的表名或列名），显著提升了端到端查询成功率。</w:t>
       </w:r>
     </w:p>
     <w:p>
       <w:r>
+        <w:rPr>
+          <w:rFonts w:ascii="Times New Roman" w:hAnsi="Times New Roman" w:eastAsia="宋体"/>
+        </w:rPr>
         <w:br w:type="page"/>
       </w:r>
     </w:p>
@@ -1599,6 +1989,9 @@
         <w:pStyle w:val="Heading1"/>
       </w:pPr>
       <w:r>
+        <w:rPr>
+          <w:rFonts w:ascii="Times New Roman" w:hAnsi="Times New Roman" w:eastAsia="宋体"/>
+        </w:rPr>
         <w:t>五、业务分析案例</w:t>
       </w:r>
     </w:p>
@@ -1607,6 +2000,9 @@
         <w:ind w:firstLine="425"/>
       </w:pPr>
       <w:r>
+        <w:rPr>
+          <w:rFonts w:ascii="Times New Roman" w:hAnsi="Times New Roman" w:eastAsia="宋体"/>
+        </w:rPr>
         <w:t>以下展示 5 个典型的业务分析案例，每个案例包含自然语言问题、生成的 SQL、查询结果和 AI 分析结论。</w:t>
       </w:r>
     </w:p>
@@ -1615,6 +2011,9 @@
         <w:pStyle w:val="Heading2"/>
       </w:pPr>
       <w:r>
+        <w:rPr>
+          <w:rFonts w:ascii="Times New Roman" w:hAnsi="Times New Roman" w:eastAsia="宋体"/>
+        </w:rPr>
         <w:t>5.1 各经验级别平均薪资</w:t>
       </w:r>
     </w:p>
@@ -1623,6 +2022,9 @@
         <w:ind w:firstLine="425"/>
       </w:pPr>
       <w:r>
+        <w:rPr>
+          <w:rFonts w:ascii="Times New Roman" w:hAnsi="Times New Roman" w:eastAsia="宋体"/>
+        </w:rPr>
         <w:t>问题：不同经验级别的 AI 岗位平均薪资分别是多少？</w:t>
       </w:r>
     </w:p>
@@ -1631,6 +2033,9 @@
         <w:ind w:firstLine="425"/>
       </w:pPr>
       <w:r>
+        <w:rPr>
+          <w:rFonts w:ascii="Times New Roman" w:hAnsi="Times New Roman" w:eastAsia="宋体"/>
+        </w:rPr>
         <w:t>生成的 SQL：</w:t>
       </w:r>
     </w:p>
@@ -1640,7 +2045,7 @@
       </w:pPr>
       <w:r>
         <w:rPr>
-          <w:rFonts w:ascii="Courier New" w:hAnsi="Courier New"/>
+          <w:rFonts w:ascii="Times New Roman" w:hAnsi="Times New Roman" w:eastAsia="宋体"/>
           <w:sz w:val="18"/>
         </w:rPr>
         <w:t xml:space="preserve">SELECT experience_level AS "Experience", </w:t>
@@ -1659,6 +2064,9 @@
         <w:ind w:firstLine="425"/>
       </w:pPr>
       <w:r>
+        <w:rPr>
+          <w:rFonts w:ascii="Times New Roman" w:hAnsi="Times New Roman" w:eastAsia="宋体"/>
+        </w:rPr>
         <w:t>【此处插入运行截图】</w:t>
       </w:r>
     </w:p>
@@ -1667,6 +2075,9 @@
         <w:ind w:firstLine="425"/>
       </w:pPr>
       <w:r>
+        <w:rPr>
+          <w:rFonts w:ascii="Times New Roman" w:hAnsi="Times New Roman" w:eastAsia="宋体"/>
+        </w:rPr>
         <w:t>AI 分析结论：Senior 级别岗位平均薪资最高，约 18 万美元，其次是 Mid-Level 约 14 万美元，Junior 约 10 万美元。高级岗位的薪资溢价显著。</w:t>
       </w:r>
     </w:p>
@@ -1675,6 +2086,9 @@
         <w:pStyle w:val="Heading2"/>
       </w:pPr>
       <w:r>
+        <w:rPr>
+          <w:rFonts w:ascii="Times New Roman" w:hAnsi="Times New Roman" w:eastAsia="宋体"/>
+        </w:rPr>
         <w:t>5.2 热门技能排行</w:t>
       </w:r>
     </w:p>
@@ -1683,6 +2097,9 @@
         <w:ind w:firstLine="425"/>
       </w:pPr>
       <w:r>
+        <w:rPr>
+          <w:rFonts w:ascii="Times New Roman" w:hAnsi="Times New Roman" w:eastAsia="宋体"/>
+        </w:rPr>
         <w:t>问题：岗位需求最多的前 10 项技能是什么？</w:t>
       </w:r>
     </w:p>
@@ -1691,6 +2108,9 @@
         <w:ind w:firstLine="425"/>
       </w:pPr>
       <w:r>
+        <w:rPr>
+          <w:rFonts w:ascii="Times New Roman" w:hAnsi="Times New Roman" w:eastAsia="宋体"/>
+        </w:rPr>
         <w:t>生成的 SQL：</w:t>
       </w:r>
     </w:p>
@@ -1700,7 +2120,7 @@
       </w:pPr>
       <w:r>
         <w:rPr>
-          <w:rFonts w:ascii="Courier New" w:hAnsi="Courier New"/>
+          <w:rFonts w:ascii="Times New Roman" w:hAnsi="Times New Roman" w:eastAsia="宋体"/>
           <w:sz w:val="18"/>
         </w:rPr>
         <w:t xml:space="preserve">SELECT skill AS "Skill", COUNT(*) AS "Job Count" </w:t>
@@ -1719,6 +2139,9 @@
         <w:ind w:firstLine="425"/>
       </w:pPr>
       <w:r>
+        <w:rPr>
+          <w:rFonts w:ascii="Times New Roman" w:hAnsi="Times New Roman" w:eastAsia="宋体"/>
+        </w:rPr>
         <w:t>【此处插入运行截图】</w:t>
       </w:r>
     </w:p>
@@ -1727,6 +2150,9 @@
         <w:ind w:firstLine="425"/>
       </w:pPr>
       <w:r>
+        <w:rPr>
+          <w:rFonts w:ascii="Times New Roman" w:hAnsi="Times New Roman" w:eastAsia="宋体"/>
+        </w:rPr>
         <w:t>AI 分析结论：Python、SQL、Cloud 是最热门的三大技能，反映出 AI 岗位对编程能力和云基础设施的高需求。</w:t>
       </w:r>
     </w:p>
@@ -1735,6 +2161,9 @@
         <w:pStyle w:val="Heading2"/>
       </w:pPr>
       <w:r>
+        <w:rPr>
+          <w:rFonts w:ascii="Times New Roman" w:hAnsi="Times New Roman" w:eastAsia="宋体"/>
+        </w:rPr>
         <w:t>5.3 远程 vs 现场岗位对比</w:t>
       </w:r>
     </w:p>
@@ -1743,6 +2172,9 @@
         <w:ind w:firstLine="425"/>
       </w:pPr>
       <w:r>
+        <w:rPr>
+          <w:rFonts w:ascii="Times New Roman" w:hAnsi="Times New Roman" w:eastAsia="宋体"/>
+        </w:rPr>
         <w:t>问题：远程岗位和现场岗位的数量和薪资差异如何？</w:t>
       </w:r>
     </w:p>
@@ -1751,6 +2183,9 @@
         <w:ind w:firstLine="425"/>
       </w:pPr>
       <w:r>
+        <w:rPr>
+          <w:rFonts w:ascii="Times New Roman" w:hAnsi="Times New Roman" w:eastAsia="宋体"/>
+        </w:rPr>
         <w:t>生成的 SQL：</w:t>
       </w:r>
     </w:p>
@@ -1760,7 +2195,7 @@
       </w:pPr>
       <w:r>
         <w:rPr>
-          <w:rFonts w:ascii="Courier New" w:hAnsi="Courier New"/>
+          <w:rFonts w:ascii="Times New Roman" w:hAnsi="Times New Roman" w:eastAsia="宋体"/>
           <w:sz w:val="18"/>
         </w:rPr>
         <w:t xml:space="preserve">SELECT CASE WHEN remote_work = 1 THEN "Remote" ELSE "On-site" END AS "Work Type", </w:t>
@@ -1777,6 +2212,9 @@
         <w:ind w:firstLine="425"/>
       </w:pPr>
       <w:r>
+        <w:rPr>
+          <w:rFonts w:ascii="Times New Roman" w:hAnsi="Times New Roman" w:eastAsia="宋体"/>
+        </w:rPr>
         <w:t>【此处插入运行截图】</w:t>
       </w:r>
     </w:p>
@@ -1785,6 +2223,9 @@
         <w:pStyle w:val="Heading2"/>
       </w:pPr>
       <w:r>
+        <w:rPr>
+          <w:rFonts w:ascii="Times New Roman" w:hAnsi="Times New Roman" w:eastAsia="宋体"/>
+        </w:rPr>
         <w:t>5.4 按年份的岗位需求趋势</w:t>
       </w:r>
     </w:p>
@@ -1793,6 +2234,9 @@
         <w:ind w:firstLine="425"/>
       </w:pPr>
       <w:r>
+        <w:rPr>
+          <w:rFonts w:ascii="Times New Roman" w:hAnsi="Times New Roman" w:eastAsia="宋体"/>
+        </w:rPr>
         <w:t>问题：2025 和 2026 年 AI 岗位数量和平均薪资有什么变化趋势？</w:t>
       </w:r>
     </w:p>
@@ -1801,6 +2245,9 @@
         <w:ind w:firstLine="425"/>
       </w:pPr>
       <w:r>
+        <w:rPr>
+          <w:rFonts w:ascii="Times New Roman" w:hAnsi="Times New Roman" w:eastAsia="宋体"/>
+        </w:rPr>
         <w:t>生成的 SQL：</w:t>
       </w:r>
     </w:p>
@@ -1810,7 +2257,7 @@
       </w:pPr>
       <w:r>
         <w:rPr>
-          <w:rFonts w:ascii="Courier New" w:hAnsi="Courier New"/>
+          <w:rFonts w:ascii="Times New Roman" w:hAnsi="Times New Roman" w:eastAsia="宋体"/>
           <w:sz w:val="18"/>
         </w:rPr>
         <w:t xml:space="preserve">SELECT posting_year AS "Year", </w:t>
@@ -1831,6 +2278,9 @@
         <w:ind w:firstLine="425"/>
       </w:pPr>
       <w:r>
+        <w:rPr>
+          <w:rFonts w:ascii="Times New Roman" w:hAnsi="Times New Roman" w:eastAsia="宋体"/>
+        </w:rPr>
         <w:t>【此处插入双轴趋势图截图】</w:t>
       </w:r>
     </w:p>
@@ -1839,6 +2289,9 @@
         <w:ind w:firstLine="425"/>
       </w:pPr>
       <w:r>
+        <w:rPr>
+          <w:rFonts w:ascii="Times New Roman" w:hAnsi="Times New Roman" w:eastAsia="宋体"/>
+        </w:rPr>
         <w:t>AI 分析结论：2026 年 AI 岗位数量相比 2025 年有所增长，平均薪资也略有上升，表明 AI 就业市场持续扩张。</w:t>
       </w:r>
     </w:p>
@@ -1847,6 +2300,9 @@
         <w:pStyle w:val="Heading2"/>
       </w:pPr>
       <w:r>
+        <w:rPr>
+          <w:rFonts w:ascii="Times New Roman" w:hAnsi="Times New Roman" w:eastAsia="宋体"/>
+        </w:rPr>
         <w:t>5.5 各岗位类别薪资分布</w:t>
       </w:r>
     </w:p>
@@ -1855,6 +2311,9 @@
         <w:ind w:firstLine="425"/>
       </w:pPr>
       <w:r>
+        <w:rPr>
+          <w:rFonts w:ascii="Times New Roman" w:hAnsi="Times New Roman" w:eastAsia="宋体"/>
+        </w:rPr>
         <w:t>问题：不同 AI 岗位类别的平均薪资和最低最高薪资分别是多少？</w:t>
       </w:r>
     </w:p>
@@ -1863,6 +2322,9 @@
         <w:ind w:firstLine="425"/>
       </w:pPr>
       <w:r>
+        <w:rPr>
+          <w:rFonts w:ascii="Times New Roman" w:hAnsi="Times New Roman" w:eastAsia="宋体"/>
+        </w:rPr>
         <w:t>生成的 SQL：</w:t>
       </w:r>
     </w:p>
@@ -1872,7 +2334,7 @@
       </w:pPr>
       <w:r>
         <w:rPr>
-          <w:rFonts w:ascii="Courier New" w:hAnsi="Courier New"/>
+          <w:rFonts w:ascii="Times New Roman" w:hAnsi="Times New Roman" w:eastAsia="宋体"/>
           <w:sz w:val="18"/>
         </w:rPr>
         <w:t xml:space="preserve">SELECT job_category AS "Category", </w:t>
@@ -1895,11 +2357,17 @@
         <w:ind w:firstLine="425"/>
       </w:pPr>
       <w:r>
+        <w:rPr>
+          <w:rFonts w:ascii="Times New Roman" w:hAnsi="Times New Roman" w:eastAsia="宋体"/>
+        </w:rPr>
         <w:t>【此处插入运行截图】</w:t>
       </w:r>
     </w:p>
     <w:p>
       <w:r>
+        <w:rPr>
+          <w:rFonts w:ascii="Times New Roman" w:hAnsi="Times New Roman" w:eastAsia="宋体"/>
+        </w:rPr>
         <w:br w:type="page"/>
       </w:r>
     </w:p>
@@ -1908,6 +2376,9 @@
         <w:pStyle w:val="Heading1"/>
       </w:pPr>
       <w:r>
+        <w:rPr>
+          <w:rFonts w:ascii="Times New Roman" w:hAnsi="Times New Roman" w:eastAsia="宋体"/>
+        </w:rPr>
         <w:t>六、可视化展示</w:t>
       </w:r>
     </w:p>
@@ -1916,6 +2387,9 @@
         <w:ind w:firstLine="425"/>
       </w:pPr>
       <w:r>
+        <w:rPr>
+          <w:rFonts w:ascii="Times New Roman" w:hAnsi="Times New Roman" w:eastAsia="宋体"/>
+        </w:rPr>
         <w:t>本系统使用 Matplotlib 实现数据可视化，通过 Streamlit 的 st.pyplot() 渲染到 Web 界面。可视化引擎采用三模版硬化路由架构（Three-Template Hardened Architecture），摒弃了传统的动态条件嵌套逻辑，转而使用三个独立的、经过充分测试的图表模板函数，根据数据特征自动路由到最合适的模板。</w:t>
       </w:r>
     </w:p>
@@ -1924,6 +2398,9 @@
         <w:pStyle w:val="Heading2"/>
       </w:pPr>
       <w:r>
+        <w:rPr>
+          <w:rFonts w:ascii="Times New Roman" w:hAnsi="Times New Roman" w:eastAsia="宋体"/>
+        </w:rPr>
         <w:t>6.1 三模版硬化路由架构</w:t>
       </w:r>
     </w:p>
@@ -1932,6 +2409,9 @@
         <w:ind w:firstLine="425"/>
       </w:pPr>
       <w:r>
+        <w:rPr>
+          <w:rFonts w:ascii="Times New Roman" w:hAnsi="Times New Roman" w:eastAsia="宋体"/>
+        </w:rPr>
         <w:t>早期版本的可视化引擎采用高度动态化的条件判断逻辑，根据 SQL 结构和数据特征动态选择图表类型。然而，这种设计在面对复杂多列数据时频繁出现类型错误（如 int + list 运算）和尺度不匹配问题（如将 200,000+ 的薪资与 50 的岗位数量绘制在同一 Y 轴上，导致小数值被压平为零）。</w:t>
       </w:r>
     </w:p>
@@ -1940,6 +2420,9 @@
         <w:ind w:firstLine="425"/>
       </w:pPr>
       <w:r>
+        <w:rPr>
+          <w:rFonts w:ascii="Times New Roman" w:hAnsi="Times New Roman" w:eastAsia="宋体"/>
+        </w:rPr>
         <w:t>经过重构，我们设计了三模版硬化路由架构，将可视化逻辑拆分为三个独立的、类型安全的模板函数，每个模板内部使用显式类型转换（.astype(float) / .values）确保数值安全。路由逻辑如下：</w:t>
       </w:r>
     </w:p>
@@ -1948,6 +2431,9 @@
         <w:pStyle w:val="Heading3"/>
       </w:pPr>
       <w:r>
+        <w:rPr>
+          <w:rFonts w:ascii="Times New Roman" w:hAnsi="Times New Roman" w:eastAsia="宋体"/>
+        </w:rPr>
         <w:t>6.1.1 模板 A：双轴趋势图（draw_dual_axis_trend）</w:t>
       </w:r>
     </w:p>
@@ -1956,6 +2442,9 @@
         <w:ind w:firstLine="425"/>
       </w:pPr>
       <w:r>
+        <w:rPr>
+          <w:rFonts w:ascii="Times New Roman" w:hAnsi="Times New Roman" w:eastAsia="宋体"/>
+        </w:rPr>
         <w:t>触发条件：数据包含时间维度列（如 posting_year），且同时包含需求量指标（Job Count）和薪资指标（Avg Salary）。</w:t>
       </w:r>
     </w:p>
@@ -1964,6 +2453,9 @@
         <w:ind w:firstLine="425"/>
       </w:pPr>
       <w:r>
+        <w:rPr>
+          <w:rFonts w:ascii="Times New Roman" w:hAnsi="Times New Roman" w:eastAsia="宋体"/>
+        </w:rPr>
         <w:t>技术实现：</w:t>
       </w:r>
     </w:p>
@@ -1973,7 +2465,7 @@
       </w:pPr>
       <w:r>
         <w:rPr>
-          <w:rFonts w:ascii="Courier New" w:hAnsi="Courier New"/>
+          <w:rFonts w:ascii="Times New Roman" w:hAnsi="Times New Roman" w:eastAsia="宋体"/>
           <w:sz w:val="18"/>
         </w:rPr>
         <w:t>fig, ax1 = plt.subplots(figsize=(10, 5))</w:t>
@@ -1998,6 +2490,9 @@
         <w:ind w:firstLine="425"/>
       </w:pPr>
       <w:r>
+        <w:rPr>
+          <w:rFonts w:ascii="Times New Roman" w:hAnsi="Times New Roman" w:eastAsia="宋体"/>
+        </w:rPr>
         <w:t>该模板完美解决了尺度不匹配问题：左轴以柱状图展示 0-200 量级的岗位数量，右轴以折线图展示100,000-250,000 量级的薪资趋势，两个量级的数据在同一图表中清晰可读，互不干扰。柱状图使用 skyblue 色彩搭配 0.6 透明度，折线图使用 coral 色彩搭配圆形标记点，视觉层次分明。图表自动添加双轴图例，确保数据可追溯。</w:t>
       </w:r>
     </w:p>
@@ -2006,6 +2501,9 @@
         <w:pStyle w:val="Heading3"/>
       </w:pPr>
       <w:r>
+        <w:rPr>
+          <w:rFonts w:ascii="Times New Roman" w:hAnsi="Times New Roman" w:eastAsia="宋体"/>
+        </w:rPr>
         <w:t>6.1.2 模板 B：纯时间线趋势图（draw_pure_trend）</w:t>
       </w:r>
     </w:p>
@@ -2014,6 +2512,9 @@
         <w:ind w:firstLine="425"/>
       </w:pPr>
       <w:r>
+        <w:rPr>
+          <w:rFonts w:ascii="Times New Roman" w:hAnsi="Times New Roman" w:eastAsia="宋体"/>
+        </w:rPr>
         <w:t>触发条件：数据包含时间维度列，但仅有一个数值指标列，或多个数值指标列的量级相近。</w:t>
       </w:r>
     </w:p>
@@ -2022,6 +2523,9 @@
         <w:ind w:firstLine="425"/>
       </w:pPr>
       <w:r>
+        <w:rPr>
+          <w:rFonts w:ascii="Times New Roman" w:hAnsi="Times New Roman" w:eastAsia="宋体"/>
+        </w:rPr>
         <w:t>技术实现：按时间列排序后，使用多条折线绘制各指标的趋势变化。每条线使用不同的颜色和标记，当指标数大于 1 时自动添加图例。X 轴标签自动旋转 45 度以防止重叠。</w:t>
       </w:r>
     </w:p>
@@ -2030,6 +2534,9 @@
         <w:pStyle w:val="Heading3"/>
       </w:pPr>
       <w:r>
+        <w:rPr>
+          <w:rFonts w:ascii="Times New Roman" w:hAnsi="Times New Roman" w:eastAsia="宋体"/>
+        </w:rPr>
         <w:t>6.1.3 模板 C：分类柱状图（draw_categorical_bar）</w:t>
       </w:r>
     </w:p>
@@ -2038,6 +2545,9 @@
         <w:ind w:firstLine="425"/>
       </w:pPr>
       <w:r>
+        <w:rPr>
+          <w:rFonts w:ascii="Times New Roman" w:hAnsi="Times New Roman" w:eastAsia="宋体"/>
+        </w:rPr>
         <w:t>触发条件：X 轴为离散分类标签（如岗位类别、技能名称、城市名），而非时间序列。</w:t>
       </w:r>
     </w:p>
@@ -2046,6 +2556,9 @@
         <w:ind w:firstLine="425"/>
       </w:pPr>
       <w:r>
+        <w:rPr>
+          <w:rFonts w:ascii="Times New Roman" w:hAnsi="Times New Roman" w:eastAsia="宋体"/>
+        </w:rPr>
         <w:t>技术实现：使用水平柱状图（barh）展示分类数据，按数值降序排列。颜色映射使用 viridis 色谱，确保视觉区分度。当分类数不超过 8 个时，自动切换为饼图（pie chart）并显示百分比标签。所有模板函数末尾均调用 plt.tight_layout()，确保标签不被截断。</w:t>
       </w:r>
     </w:p>
@@ -2054,6 +2567,9 @@
         <w:pStyle w:val="Heading2"/>
       </w:pPr>
       <w:r>
+        <w:rPr>
+          <w:rFonts w:ascii="Times New Roman" w:hAnsi="Times New Roman" w:eastAsia="宋体"/>
+        </w:rPr>
         <w:t>6.2 图表类型决策矩阵</w:t>
       </w:r>
     </w:p>
@@ -2081,6 +2597,7 @@
             </w:pPr>
             <w:r>
               <w:rPr>
+                <w:rFonts w:ascii="Times New Roman" w:hAnsi="Times New Roman" w:eastAsia="宋体"/>
                 <w:b/>
               </w:rPr>
               <w:t>模板</w:t>
@@ -2097,6 +2614,7 @@
             </w:pPr>
             <w:r>
               <w:rPr>
+                <w:rFonts w:ascii="Times New Roman" w:hAnsi="Times New Roman" w:eastAsia="宋体"/>
                 <w:b/>
               </w:rPr>
               <w:t>触发条件</w:t>
@@ -2113,6 +2631,7 @@
             </w:pPr>
             <w:r>
               <w:rPr>
+                <w:rFonts w:ascii="Times New Roman" w:hAnsi="Times New Roman" w:eastAsia="宋体"/>
                 <w:b/>
               </w:rPr>
               <w:t>图表类型</w:t>
@@ -2129,6 +2648,7 @@
             </w:pPr>
             <w:r>
               <w:rPr>
+                <w:rFonts w:ascii="Times New Roman" w:hAnsi="Times New Roman" w:eastAsia="宋体"/>
                 <w:b/>
               </w:rPr>
               <w:t>应用场景</w:t>
@@ -2143,6 +2663,9 @@
           </w:tcPr>
           <w:p>
             <w:r>
+              <w:rPr>
+                <w:rFonts w:ascii="Times New Roman" w:hAnsi="Times New Roman" w:eastAsia="宋体"/>
+              </w:rPr>
               <w:t>A: 双轴趋势图</w:t>
             </w:r>
           </w:p>
@@ -2153,6 +2676,9 @@
           </w:tcPr>
           <w:p>
             <w:r>
+              <w:rPr>
+                <w:rFonts w:ascii="Times New Roman" w:hAnsi="Times New Roman" w:eastAsia="宋体"/>
+              </w:rPr>
               <w:t>时间列 + count + salary</w:t>
             </w:r>
           </w:p>
@@ -2163,6 +2689,9 @@
           </w:tcPr>
           <w:p>
             <w:r>
+              <w:rPr>
+                <w:rFonts w:ascii="Times New Roman" w:hAnsi="Times New Roman" w:eastAsia="宋体"/>
+              </w:rPr>
               <w:t>柱状图 + 折线图（双 Y 轴）</w:t>
             </w:r>
           </w:p>
@@ -2173,6 +2702,9 @@
           </w:tcPr>
           <w:p>
             <w:r>
+              <w:rPr>
+                <w:rFonts w:ascii="Times New Roman" w:hAnsi="Times New Roman" w:eastAsia="宋体"/>
+              </w:rPr>
               <w:t>年度岗位数量与薪资趋势对比</w:t>
             </w:r>
           </w:p>
@@ -2185,6 +2717,9 @@
           </w:tcPr>
           <w:p>
             <w:r>
+              <w:rPr>
+                <w:rFonts w:ascii="Times New Roman" w:hAnsi="Times New Roman" w:eastAsia="宋体"/>
+              </w:rPr>
               <w:t>B: 纯时间线图</w:t>
             </w:r>
           </w:p>
@@ -2195,6 +2730,9 @@
           </w:tcPr>
           <w:p>
             <w:r>
+              <w:rPr>
+                <w:rFonts w:ascii="Times New Roman" w:hAnsi="Times New Roman" w:eastAsia="宋体"/>
+              </w:rPr>
               <w:t>时间列 + 单一/对齐指标</w:t>
             </w:r>
           </w:p>
@@ -2205,6 +2743,9 @@
           </w:tcPr>
           <w:p>
             <w:r>
+              <w:rPr>
+                <w:rFonts w:ascii="Times New Roman" w:hAnsi="Times New Roman" w:eastAsia="宋体"/>
+              </w:rPr>
               <w:t>多线折线图</w:t>
             </w:r>
           </w:p>
@@ -2215,6 +2756,9 @@
           </w:tcPr>
           <w:p>
             <w:r>
+              <w:rPr>
+                <w:rFonts w:ascii="Times New Roman" w:hAnsi="Times New Roman" w:eastAsia="宋体"/>
+              </w:rPr>
               <w:t>月度变化、单一指标趋势</w:t>
             </w:r>
           </w:p>
@@ -2227,6 +2771,9 @@
           </w:tcPr>
           <w:p>
             <w:r>
+              <w:rPr>
+                <w:rFonts w:ascii="Times New Roman" w:hAnsi="Times New Roman" w:eastAsia="宋体"/>
+              </w:rPr>
               <w:t>C: 分类柱状图</w:t>
             </w:r>
           </w:p>
@@ -2237,6 +2784,9 @@
           </w:tcPr>
           <w:p>
             <w:r>
+              <w:rPr>
+                <w:rFonts w:ascii="Times New Roman" w:hAnsi="Times New Roman" w:eastAsia="宋体"/>
+              </w:rPr>
               <w:t>离散分类标签 + 聚合值</w:t>
             </w:r>
           </w:p>
@@ -2247,6 +2797,9 @@
           </w:tcPr>
           <w:p>
             <w:r>
+              <w:rPr>
+                <w:rFonts w:ascii="Times New Roman" w:hAnsi="Times New Roman" w:eastAsia="宋体"/>
+              </w:rPr>
               <w:t>水平柱状图 / 饼图</w:t>
             </w:r>
           </w:p>
@@ -2257,6 +2810,9 @@
           </w:tcPr>
           <w:p>
             <w:r>
+              <w:rPr>
+                <w:rFonts w:ascii="Times New Roman" w:hAnsi="Times New Roman" w:eastAsia="宋体"/>
+              </w:rPr>
               <w:t>技能排行、城市分布、类别对比</w:t>
             </w:r>
           </w:p>
@@ -2269,6 +2825,9 @@
           </w:tcPr>
           <w:p>
             <w:r>
+              <w:rPr>
+                <w:rFonts w:ascii="Times New Roman" w:hAnsi="Times New Roman" w:eastAsia="宋体"/>
+              </w:rPr>
               <w:t>散点图</w:t>
             </w:r>
           </w:p>
@@ -2279,6 +2838,9 @@
           </w:tcPr>
           <w:p>
             <w:r>
+              <w:rPr>
+                <w:rFonts w:ascii="Times New Roman" w:hAnsi="Times New Roman" w:eastAsia="宋体"/>
+              </w:rPr>
               <w:t>两列均为数值型</w:t>
             </w:r>
           </w:p>
@@ -2289,6 +2851,9 @@
           </w:tcPr>
           <w:p>
             <w:r>
+              <w:rPr>
+                <w:rFonts w:ascii="Times New Roman" w:hAnsi="Times New Roman" w:eastAsia="宋体"/>
+              </w:rPr>
               <w:t>散点图</w:t>
             </w:r>
           </w:p>
@@ -2299,6 +2864,9 @@
           </w:tcPr>
           <w:p>
             <w:r>
+              <w:rPr>
+                <w:rFonts w:ascii="Times New Roman" w:hAnsi="Times New Roman" w:eastAsia="宋体"/>
+              </w:rPr>
               <w:t>数值关系分析</w:t>
             </w:r>
           </w:p>
@@ -2310,6 +2878,9 @@
         <w:pStyle w:val="Heading2"/>
       </w:pPr>
       <w:r>
+        <w:rPr>
+          <w:rFonts w:ascii="Times New Roman" w:hAnsi="Times New Roman" w:eastAsia="宋体"/>
+        </w:rPr>
         <w:t>6.3 单行结果降级策略</w:t>
       </w:r>
     </w:p>
@@ -2318,6 +2889,9 @@
         <w:ind w:firstLine="425"/>
       </w:pPr>
       <w:r>
+        <w:rPr>
+          <w:rFonts w:ascii="Times New Roman" w:hAnsi="Times New Roman" w:eastAsia="宋体"/>
+        </w:rPr>
         <w:t>当查询返回仅一行结果时（如总数统计），系统不会强制渲染无意义的图表，而是自动降级为 Streamlit 的 st.metric 组件，以卡片形式清晰展示关键指标数值。这一设计避免了单行数据生成纯色块图表的视觉问题。</w:t>
       </w:r>
     </w:p>
@@ -2326,6 +2900,9 @@
         <w:pStyle w:val="Heading2"/>
       </w:pPr>
       <w:r>
+        <w:rPr>
+          <w:rFonts w:ascii="Times New Roman" w:hAnsi="Times New Roman" w:eastAsia="宋体"/>
+        </w:rPr>
         <w:t>6.4 可视化截图</w:t>
       </w:r>
     </w:p>
@@ -2334,11 +2911,17 @@
         <w:ind w:firstLine="425"/>
       </w:pPr>
       <w:r>
+        <w:rPr>
+          <w:rFonts w:ascii="Times New Roman" w:hAnsi="Times New Roman" w:eastAsia="宋体"/>
+        </w:rPr>
         <w:t>【此处插入各类图表的运行截图】</w:t>
       </w:r>
     </w:p>
     <w:p>
       <w:r>
+        <w:rPr>
+          <w:rFonts w:ascii="Times New Roman" w:hAnsi="Times New Roman" w:eastAsia="宋体"/>
+        </w:rPr>
         <w:br w:type="page"/>
       </w:r>
     </w:p>
@@ -2347,6 +2930,9 @@
         <w:pStyle w:val="Heading1"/>
       </w:pPr>
       <w:r>
+        <w:rPr>
+          <w:rFonts w:ascii="Times New Roman" w:hAnsi="Times New Roman" w:eastAsia="宋体"/>
+        </w:rPr>
         <w:t>七、大模型使用说明</w:t>
       </w:r>
     </w:p>
@@ -2355,6 +2941,9 @@
         <w:pStyle w:val="Heading2"/>
       </w:pPr>
       <w:r>
+        <w:rPr>
+          <w:rFonts w:ascii="Times New Roman" w:hAnsi="Times New Roman" w:eastAsia="宋体"/>
+        </w:rPr>
         <w:t>7.1 模型选型</w:t>
       </w:r>
     </w:p>
@@ -2363,6 +2952,9 @@
         <w:ind w:firstLine="425"/>
       </w:pPr>
       <w:r>
+        <w:rPr>
+          <w:rFonts w:ascii="Times New Roman" w:hAnsi="Times New Roman" w:eastAsia="宋体"/>
+        </w:rPr>
         <w:t>本项目使用 DeepSeek Chat（deepseek-chat）作为主要推理模型。选择理由如下：</w:t>
       </w:r>
     </w:p>
@@ -2371,6 +2963,9 @@
         <w:pStyle w:val="ListBullet"/>
       </w:pPr>
       <w:r>
+        <w:rPr>
+          <w:rFonts w:ascii="Times New Roman" w:hAnsi="Times New Roman" w:eastAsia="宋体"/>
+        </w:rPr>
         <w:t>兼容性好：DeepSeek API 完全兼容 OpenAI SDK 格式，可直接通过 LangChain 的 ChatOpenAI 接口调用</w:t>
       </w:r>
     </w:p>
@@ -2379,6 +2974,9 @@
         <w:pStyle w:val="ListBullet"/>
       </w:pPr>
       <w:r>
+        <w:rPr>
+          <w:rFonts w:ascii="Times New Roman" w:hAnsi="Times New Roman" w:eastAsia="宋体"/>
+        </w:rPr>
         <w:t>性价比高：DeepSeek 提供免费额度，适合学生项目使用</w:t>
       </w:r>
     </w:p>
@@ -2387,6 +2985,9 @@
         <w:pStyle w:val="ListBullet"/>
       </w:pPr>
       <w:r>
+        <w:rPr>
+          <w:rFonts w:ascii="Times New Roman" w:hAnsi="Times New Roman" w:eastAsia="宋体"/>
+        </w:rPr>
         <w:t>中文能力强：DeepSeek 对中文的理解和生成能力优秀，适合生成中文分析结论</w:t>
       </w:r>
     </w:p>
@@ -2395,6 +2996,9 @@
         <w:pStyle w:val="ListBullet"/>
       </w:pPr>
       <w:r>
+        <w:rPr>
+          <w:rFonts w:ascii="Times New Roman" w:hAnsi="Times New Roman" w:eastAsia="宋体"/>
+        </w:rPr>
         <w:t>SQL 生成质量高：在 NL-to-SQL 任务中表现稳定，生成的 SQL 语法正确率高</w:t>
       </w:r>
     </w:p>
@@ -2403,6 +3007,9 @@
         <w:pStyle w:val="Heading2"/>
       </w:pPr>
       <w:r>
+        <w:rPr>
+          <w:rFonts w:ascii="Times New Roman" w:hAnsi="Times New Roman" w:eastAsia="宋体"/>
+        </w:rPr>
         <w:t>7.2 使用场景与关键提示词</w:t>
       </w:r>
     </w:p>
@@ -2411,6 +3018,9 @@
         <w:ind w:firstLine="425"/>
       </w:pPr>
       <w:r>
+        <w:rPr>
+          <w:rFonts w:ascii="Times New Roman" w:hAnsi="Times New Roman" w:eastAsia="宋体"/>
+        </w:rPr>
         <w:t>大模型在本项目中用于以下两个核心环节：</w:t>
       </w:r>
     </w:p>
@@ -2419,6 +3029,9 @@
         <w:pStyle w:val="Heading3"/>
       </w:pPr>
       <w:r>
+        <w:rPr>
+          <w:rFonts w:ascii="Times New Roman" w:hAnsi="Times New Roman" w:eastAsia="宋体"/>
+        </w:rPr>
         <w:t>7.2.1 SQL 生成</w:t>
       </w:r>
     </w:p>
@@ -2427,6 +3040,9 @@
         <w:ind w:firstLine="425"/>
       </w:pPr>
       <w:r>
+        <w:rPr>
+          <w:rFonts w:ascii="Times New Roman" w:hAnsi="Times New Roman" w:eastAsia="宋体"/>
+        </w:rPr>
         <w:t>系统提示词（SystemMessage）：</w:t>
       </w:r>
     </w:p>
@@ -2436,7 +3052,7 @@
       </w:pPr>
       <w:r>
         <w:rPr>
-          <w:rFonts w:ascii="Courier New" w:hAnsi="Courier New"/>
+          <w:rFonts w:ascii="Times New Roman" w:hAnsi="Times New Roman" w:eastAsia="宋体"/>
           <w:sz w:val="18"/>
         </w:rPr>
         <w:t>You are a SQLite expert.</w:t>
@@ -2456,6 +3072,9 @@
         <w:ind w:firstLine="425"/>
       </w:pPr>
       <w:r>
+        <w:rPr>
+          <w:rFonts w:ascii="Times New Roman" w:hAnsi="Times New Roman" w:eastAsia="宋体"/>
+        </w:rPr>
         <w:t>用户提示词（HumanMessage）：</w:t>
       </w:r>
     </w:p>
@@ -2465,7 +3084,7 @@
       </w:pPr>
       <w:r>
         <w:rPr>
-          <w:rFonts w:ascii="Courier New" w:hAnsi="Courier New"/>
+          <w:rFonts w:ascii="Times New Roman" w:hAnsi="Times New Roman" w:eastAsia="宋体"/>
           <w:sz w:val="18"/>
         </w:rPr>
         <w:t>Question: {用户的自然语言问题}</w:t>
@@ -2476,6 +3095,9 @@
         <w:pStyle w:val="Heading3"/>
       </w:pPr>
       <w:r>
+        <w:rPr>
+          <w:rFonts w:ascii="Times New Roman" w:hAnsi="Times New Roman" w:eastAsia="宋体"/>
+        </w:rPr>
         <w:t>7.2.2 结果分析总结</w:t>
       </w:r>
     </w:p>
@@ -2484,6 +3106,9 @@
         <w:ind w:firstLine="425"/>
       </w:pPr>
       <w:r>
+        <w:rPr>
+          <w:rFonts w:ascii="Times New Roman" w:hAnsi="Times New Roman" w:eastAsia="宋体"/>
+        </w:rPr>
         <w:t>系统提示词：</w:t>
       </w:r>
     </w:p>
@@ -2493,7 +3118,7 @@
       </w:pPr>
       <w:r>
         <w:rPr>
-          <w:rFonts w:ascii="Courier New" w:hAnsi="Courier New"/>
+          <w:rFonts w:ascii="Times New Roman" w:hAnsi="Times New Roman" w:eastAsia="宋体"/>
           <w:sz w:val="18"/>
         </w:rPr>
         <w:t>请用中文对以下数据进行简明扼要的商业分析总结。</w:t>
@@ -2508,6 +3133,9 @@
         <w:ind w:firstLine="425"/>
       </w:pPr>
       <w:r>
+        <w:rPr>
+          <w:rFonts w:ascii="Times New Roman" w:hAnsi="Times New Roman" w:eastAsia="宋体"/>
+        </w:rPr>
         <w:t>用户提示词包含：原始问题、执行的 SQL、查询列名、查询结果（最多 15 行）</w:t>
       </w:r>
     </w:p>
@@ -2516,6 +3144,9 @@
         <w:pStyle w:val="Heading2"/>
       </w:pPr>
       <w:r>
+        <w:rPr>
+          <w:rFonts w:ascii="Times New Roman" w:hAnsi="Times New Roman" w:eastAsia="宋体"/>
+        </w:rPr>
         <w:t>7.3 人工修改说明</w:t>
       </w:r>
     </w:p>
@@ -2524,6 +3155,9 @@
         <w:ind w:firstLine="425"/>
       </w:pPr>
       <w:r>
+        <w:rPr>
+          <w:rFonts w:ascii="Times New Roman" w:hAnsi="Times New Roman" w:eastAsia="宋体"/>
+        </w:rPr>
         <w:t>LLM 生成的 SQL 和分析结论在以下方面经过人工审查和调整：</w:t>
         <w:br/>
         <w:t>（1）SQL 生成规则（SQL_RULES）经过多次迭代优化，以提高 SQL 生成的准确性和安全性；</w:t>
@@ -2540,6 +3174,9 @@
         <w:pStyle w:val="Heading2"/>
       </w:pPr>
       <w:r>
+        <w:rPr>
+          <w:rFonts w:ascii="Times New Roman" w:hAnsi="Times New Roman" w:eastAsia="宋体"/>
+        </w:rPr>
         <w:t>7.4 大模型发挥的作用</w:t>
       </w:r>
     </w:p>
@@ -2548,6 +3185,9 @@
         <w:ind w:firstLine="425"/>
       </w:pPr>
       <w:r>
+        <w:rPr>
+          <w:rFonts w:ascii="Times New Roman" w:hAnsi="Times New Roman" w:eastAsia="宋体"/>
+        </w:rPr>
         <w:t>大模型在本项目中是核心组件，主要发挥了以下作用：</w:t>
         <w:br/>
         <w:t>（1）自然语言理解：将用户的中文/英文问题转化为结构化的数据库查询意图；</w:t>
@@ -2561,6 +3201,9 @@
     </w:p>
     <w:p>
       <w:r>
+        <w:rPr>
+          <w:rFonts w:ascii="Times New Roman" w:hAnsi="Times New Roman" w:eastAsia="宋体"/>
+        </w:rPr>
         <w:br w:type="page"/>
       </w:r>
     </w:p>
@@ -2569,6 +3212,9 @@
         <w:pStyle w:val="Heading1"/>
       </w:pPr>
       <w:r>
+        <w:rPr>
+          <w:rFonts w:ascii="Times New Roman" w:hAnsi="Times New Roman" w:eastAsia="宋体"/>
+        </w:rPr>
         <w:t>八、运行环境与复现说明</w:t>
       </w:r>
     </w:p>
@@ -2577,6 +3223,9 @@
         <w:pStyle w:val="Heading2"/>
       </w:pPr>
       <w:r>
+        <w:rPr>
+          <w:rFonts w:ascii="Times New Roman" w:hAnsi="Times New Roman" w:eastAsia="宋体"/>
+        </w:rPr>
         <w:t>8.1 软件环境</w:t>
       </w:r>
     </w:p>
@@ -2603,6 +3252,7 @@
             </w:pPr>
             <w:r>
               <w:rPr>
+                <w:rFonts w:ascii="Times New Roman" w:hAnsi="Times New Roman" w:eastAsia="宋体"/>
                 <w:b/>
               </w:rPr>
               <w:t>软件/库</w:t>
@@ -2619,6 +3269,7 @@
             </w:pPr>
             <w:r>
               <w:rPr>
+                <w:rFonts w:ascii="Times New Roman" w:hAnsi="Times New Roman" w:eastAsia="宋体"/>
                 <w:b/>
               </w:rPr>
               <w:t>版本要求</w:t>
@@ -2635,6 +3286,7 @@
             </w:pPr>
             <w:r>
               <w:rPr>
+                <w:rFonts w:ascii="Times New Roman" w:hAnsi="Times New Roman" w:eastAsia="宋体"/>
                 <w:b/>
               </w:rPr>
               <w:t>用途</w:t>
@@ -2649,6 +3301,9 @@
           </w:tcPr>
           <w:p>
             <w:r>
+              <w:rPr>
+                <w:rFonts w:ascii="Times New Roman" w:hAnsi="Times New Roman" w:eastAsia="宋体"/>
+              </w:rPr>
               <w:t>Python</w:t>
             </w:r>
           </w:p>
@@ -2659,6 +3314,9 @@
           </w:tcPr>
           <w:p>
             <w:r>
+              <w:rPr>
+                <w:rFonts w:ascii="Times New Roman" w:hAnsi="Times New Roman" w:eastAsia="宋体"/>
+              </w:rPr>
               <w:t>3.10+</w:t>
             </w:r>
           </w:p>
@@ -2669,6 +3327,9 @@
           </w:tcPr>
           <w:p>
             <w:r>
+              <w:rPr>
+                <w:rFonts w:ascii="Times New Roman" w:hAnsi="Times New Roman" w:eastAsia="宋体"/>
+              </w:rPr>
               <w:t>主要开发语言</w:t>
             </w:r>
           </w:p>
@@ -2681,6 +3342,9 @@
           </w:tcPr>
           <w:p>
             <w:r>
+              <w:rPr>
+                <w:rFonts w:ascii="Times New Roman" w:hAnsi="Times New Roman" w:eastAsia="宋体"/>
+              </w:rPr>
               <w:t>pandas</w:t>
             </w:r>
           </w:p>
@@ -2691,6 +3355,9 @@
           </w:tcPr>
           <w:p>
             <w:r>
+              <w:rPr>
+                <w:rFonts w:ascii="Times New Roman" w:hAnsi="Times New Roman" w:eastAsia="宋体"/>
+              </w:rPr>
               <w:t>&gt;=1.5</w:t>
             </w:r>
           </w:p>
@@ -2701,6 +3368,9 @@
           </w:tcPr>
           <w:p>
             <w:r>
+              <w:rPr>
+                <w:rFonts w:ascii="Times New Roman" w:hAnsi="Times New Roman" w:eastAsia="宋体"/>
+              </w:rPr>
               <w:t>数据预处理</w:t>
             </w:r>
           </w:p>
@@ -2713,6 +3383,9 @@
           </w:tcPr>
           <w:p>
             <w:r>
+              <w:rPr>
+                <w:rFonts w:ascii="Times New Roman" w:hAnsi="Times New Roman" w:eastAsia="宋体"/>
+              </w:rPr>
               <w:t>LangChain</w:t>
             </w:r>
           </w:p>
@@ -2723,6 +3396,9 @@
           </w:tcPr>
           <w:p>
             <w:r>
+              <w:rPr>
+                <w:rFonts w:ascii="Times New Roman" w:hAnsi="Times New Roman" w:eastAsia="宋体"/>
+              </w:rPr>
               <w:t>&gt;=0.2</w:t>
             </w:r>
           </w:p>
@@ -2733,6 +3409,9 @@
           </w:tcPr>
           <w:p>
             <w:r>
+              <w:rPr>
+                <w:rFonts w:ascii="Times New Roman" w:hAnsi="Times New Roman" w:eastAsia="宋体"/>
+              </w:rPr>
               <w:t>LLM 调用框架</w:t>
             </w:r>
           </w:p>
@@ -2745,6 +3424,9 @@
           </w:tcPr>
           <w:p>
             <w:r>
+              <w:rPr>
+                <w:rFonts w:ascii="Times New Roman" w:hAnsi="Times New Roman" w:eastAsia="宋体"/>
+              </w:rPr>
               <w:t>langchain-openai</w:t>
             </w:r>
           </w:p>
@@ -2755,6 +3437,9 @@
           </w:tcPr>
           <w:p>
             <w:r>
+              <w:rPr>
+                <w:rFonts w:ascii="Times New Roman" w:hAnsi="Times New Roman" w:eastAsia="宋体"/>
+              </w:rPr>
               <w:t>&gt;=0.1</w:t>
             </w:r>
           </w:p>
@@ -2765,6 +3450,9 @@
           </w:tcPr>
           <w:p>
             <w:r>
+              <w:rPr>
+                <w:rFonts w:ascii="Times New Roman" w:hAnsi="Times New Roman" w:eastAsia="宋体"/>
+              </w:rPr>
               <w:t>OpenAI 兼容接口</w:t>
             </w:r>
           </w:p>
@@ -2777,6 +3465,9 @@
           </w:tcPr>
           <w:p>
             <w:r>
+              <w:rPr>
+                <w:rFonts w:ascii="Times New Roman" w:hAnsi="Times New Roman" w:eastAsia="宋体"/>
+              </w:rPr>
               <w:t>SQLite</w:t>
             </w:r>
           </w:p>
@@ -2787,6 +3478,9 @@
           </w:tcPr>
           <w:p>
             <w:r>
+              <w:rPr>
+                <w:rFonts w:ascii="Times New Roman" w:hAnsi="Times New Roman" w:eastAsia="宋体"/>
+              </w:rPr>
               <w:t>3.x</w:t>
             </w:r>
           </w:p>
@@ -2797,6 +3491,9 @@
           </w:tcPr>
           <w:p>
             <w:r>
+              <w:rPr>
+                <w:rFonts w:ascii="Times New Roman" w:hAnsi="Times New Roman" w:eastAsia="宋体"/>
+              </w:rPr>
               <w:t>关系数据库</w:t>
             </w:r>
           </w:p>
@@ -2809,6 +3506,9 @@
           </w:tcPr>
           <w:p>
             <w:r>
+              <w:rPr>
+                <w:rFonts w:ascii="Times New Roman" w:hAnsi="Times New Roman" w:eastAsia="宋体"/>
+              </w:rPr>
               <w:t>Streamlit</w:t>
             </w:r>
           </w:p>
@@ -2819,6 +3519,9 @@
           </w:tcPr>
           <w:p>
             <w:r>
+              <w:rPr>
+                <w:rFonts w:ascii="Times New Roman" w:hAnsi="Times New Roman" w:eastAsia="宋体"/>
+              </w:rPr>
               <w:t>&gt;=1.30</w:t>
             </w:r>
           </w:p>
@@ -2829,6 +3532,9 @@
           </w:tcPr>
           <w:p>
             <w:r>
+              <w:rPr>
+                <w:rFonts w:ascii="Times New Roman" w:hAnsi="Times New Roman" w:eastAsia="宋体"/>
+              </w:rPr>
               <w:t>Web UI 框架</w:t>
             </w:r>
           </w:p>
@@ -2841,6 +3547,9 @@
           </w:tcPr>
           <w:p>
             <w:r>
+              <w:rPr>
+                <w:rFonts w:ascii="Times New Roman" w:hAnsi="Times New Roman" w:eastAsia="宋体"/>
+              </w:rPr>
               <w:t>Matplotlib</w:t>
             </w:r>
           </w:p>
@@ -2851,6 +3560,9 @@
           </w:tcPr>
           <w:p>
             <w:r>
+              <w:rPr>
+                <w:rFonts w:ascii="Times New Roman" w:hAnsi="Times New Roman" w:eastAsia="宋体"/>
+              </w:rPr>
               <w:t>&gt;=3.7</w:t>
             </w:r>
           </w:p>
@@ -2861,6 +3573,9 @@
           </w:tcPr>
           <w:p>
             <w:r>
+              <w:rPr>
+                <w:rFonts w:ascii="Times New Roman" w:hAnsi="Times New Roman" w:eastAsia="宋体"/>
+              </w:rPr>
               <w:t>数据可视化</w:t>
             </w:r>
           </w:p>
@@ -2873,6 +3588,9 @@
           </w:tcPr>
           <w:p>
             <w:r>
+              <w:rPr>
+                <w:rFonts w:ascii="Times New Roman" w:hAnsi="Times New Roman" w:eastAsia="宋体"/>
+              </w:rPr>
               <w:t>python-dotenv</w:t>
             </w:r>
           </w:p>
@@ -2883,6 +3601,9 @@
           </w:tcPr>
           <w:p>
             <w:r>
+              <w:rPr>
+                <w:rFonts w:ascii="Times New Roman" w:hAnsi="Times New Roman" w:eastAsia="宋体"/>
+              </w:rPr>
               <w:t>&gt;=1.0</w:t>
             </w:r>
           </w:p>
@@ -2893,6 +3614,9 @@
           </w:tcPr>
           <w:p>
             <w:r>
+              <w:rPr>
+                <w:rFonts w:ascii="Times New Roman" w:hAnsi="Times New Roman" w:eastAsia="宋体"/>
+              </w:rPr>
               <w:t>环境变量管理</w:t>
             </w:r>
           </w:p>
@@ -2905,6 +3629,9 @@
           </w:tcPr>
           <w:p>
             <w:r>
+              <w:rPr>
+                <w:rFonts w:ascii="Times New Roman" w:hAnsi="Times New Roman" w:eastAsia="宋体"/>
+              </w:rPr>
               <w:t>DeepSeek API</w:t>
             </w:r>
           </w:p>
@@ -2915,6 +3642,9 @@
           </w:tcPr>
           <w:p>
             <w:r>
+              <w:rPr>
+                <w:rFonts w:ascii="Times New Roman" w:hAnsi="Times New Roman" w:eastAsia="宋体"/>
+              </w:rPr>
               <w:t>--</w:t>
             </w:r>
           </w:p>
@@ -2925,6 +3655,9 @@
           </w:tcPr>
           <w:p>
             <w:r>
+              <w:rPr>
+                <w:rFonts w:ascii="Times New Roman" w:hAnsi="Times New Roman" w:eastAsia="宋体"/>
+              </w:rPr>
               <w:t>大模型推理服务</w:t>
             </w:r>
           </w:p>
@@ -2936,36 +3669,57 @@
         <w:pStyle w:val="Heading2"/>
       </w:pPr>
       <w:r>
+        <w:rPr>
+          <w:rFonts w:ascii="Times New Roman" w:hAnsi="Times New Roman" w:eastAsia="宋体"/>
+        </w:rPr>
         <w:t>8.2 复现步骤</w:t>
       </w:r>
     </w:p>
     <w:p>
       <w:r>
+        <w:rPr>
+          <w:rFonts w:ascii="Times New Roman" w:hAnsi="Times New Roman" w:eastAsia="宋体"/>
+        </w:rPr>
         <w:t>1. 安装依赖：pip install -r requirements.txt</w:t>
       </w:r>
     </w:p>
     <w:p>
       <w:r>
+        <w:rPr>
+          <w:rFonts w:ascii="Times New Roman" w:hAnsi="Times New Roman" w:eastAsia="宋体"/>
+        </w:rPr>
         <w:t>2. 配置环境变量：cp .env.example .env，然后编辑 .env 填入 DeepSeek API Key</w:t>
       </w:r>
     </w:p>
     <w:p>
       <w:r>
+        <w:rPr>
+          <w:rFonts w:ascii="Times New Roman" w:hAnsi="Times New Roman" w:eastAsia="宋体"/>
+        </w:rPr>
         <w:t>3. 初始化数据库：python3 scripts/init_db.py（需确保 data/ 目录下有 CSV 文件）</w:t>
       </w:r>
     </w:p>
     <w:p>
       <w:r>
+        <w:rPr>
+          <w:rFonts w:ascii="Times New Roman" w:hAnsi="Times New Roman" w:eastAsia="宋体"/>
+        </w:rPr>
         <w:t>4. 运行单元测试：python3 -m unittest discover tests/ -v（确认 21 项测试全部通过）</w:t>
       </w:r>
     </w:p>
     <w:p>
       <w:r>
+        <w:rPr>
+          <w:rFonts w:ascii="Times New Roman" w:hAnsi="Times New Roman" w:eastAsia="宋体"/>
+        </w:rPr>
         <w:t>5. 启动 Web UI：streamlit run app.py，打开 http://localhost:8501</w:t>
       </w:r>
     </w:p>
     <w:p>
       <w:r>
+        <w:rPr>
+          <w:rFonts w:ascii="Times New Roman" w:hAnsi="Times New Roman" w:eastAsia="宋体"/>
+        </w:rPr>
         <w:t>6. 在 Smart Query 标签页输入自然语言问题进行查询</w:t>
       </w:r>
     </w:p>
@@ -2974,6 +3728,9 @@
         <w:pStyle w:val="Heading2"/>
       </w:pPr>
       <w:r>
+        <w:rPr>
+          <w:rFonts w:ascii="Times New Roman" w:hAnsi="Times New Roman" w:eastAsia="宋体"/>
+        </w:rPr>
         <w:t>8.3 数据库验证</w:t>
       </w:r>
     </w:p>
@@ -2982,6 +3739,9 @@
         <w:ind w:firstLine="425"/>
       </w:pPr>
       <w:r>
+        <w:rPr>
+          <w:rFonts w:ascii="Times New Roman" w:hAnsi="Times New Roman" w:eastAsia="宋体"/>
+        </w:rPr>
         <w:t>可通过以下 SQL 验证数据导入成功：</w:t>
       </w:r>
     </w:p>
@@ -2991,7 +3751,7 @@
       </w:pPr>
       <w:r>
         <w:rPr>
-          <w:rFonts w:ascii="Courier New" w:hAnsi="Courier New"/>
+          <w:rFonts w:ascii="Times New Roman" w:hAnsi="Times New Roman" w:eastAsia="宋体"/>
           <w:sz w:val="18"/>
         </w:rPr>
         <w:t>SELECT COUNT(*) FROM job_postings;       -- 应返回 1500</w:t>
@@ -3003,6 +3763,9 @@
     </w:p>
     <w:p>
       <w:r>
+        <w:rPr>
+          <w:rFonts w:ascii="Times New Roman" w:hAnsi="Times New Roman" w:eastAsia="宋体"/>
+        </w:rPr>
         <w:br w:type="page"/>
       </w:r>
     </w:p>
@@ -3011,6 +3774,9 @@
         <w:pStyle w:val="Heading1"/>
       </w:pPr>
       <w:r>
+        <w:rPr>
+          <w:rFonts w:ascii="Times New Roman" w:hAnsi="Times New Roman" w:eastAsia="宋体"/>
+        </w:rPr>
         <w:t>九、自动化单元测试与健壮性保障</w:t>
       </w:r>
     </w:p>
@@ -3019,6 +3785,9 @@
         <w:pStyle w:val="Heading2"/>
       </w:pPr>
       <w:r>
+        <w:rPr>
+          <w:rFonts w:ascii="Times New Roman" w:hAnsi="Times New Roman" w:eastAsia="宋体"/>
+        </w:rPr>
         <w:t>9.1 测试框架选型</w:t>
       </w:r>
     </w:p>
@@ -3027,6 +3796,9 @@
         <w:ind w:firstLine="425"/>
       </w:pPr>
       <w:r>
+        <w:rPr>
+          <w:rFonts w:ascii="Times New Roman" w:hAnsi="Times New Roman" w:eastAsia="宋体"/>
+        </w:rPr>
         <w:t>本项目采用 Python 标准库 unittest 作为测试框架，测试文件位于 tests/test_llm_utils.py。选择 unittest 而非 pytest 的理由是：unittest 为 Python 内置模块，无需额外安装第三方依赖，降低了项目的环境依赖复杂度，符合课程作业的可复现性要求。</w:t>
       </w:r>
     </w:p>
@@ -3035,6 +3807,9 @@
         <w:ind w:firstLine="425"/>
       </w:pPr>
       <w:r>
+        <w:rPr>
+          <w:rFonts w:ascii="Times New Roman" w:hAnsi="Times New Roman" w:eastAsia="宋体"/>
+        </w:rPr>
         <w:t>运行命令：python3 -m unittest discover tests/ -v</w:t>
       </w:r>
     </w:p>
@@ -3043,6 +3818,9 @@
         <w:pStyle w:val="Heading2"/>
       </w:pPr>
       <w:r>
+        <w:rPr>
+          <w:rFonts w:ascii="Times New Roman" w:hAnsi="Times New Roman" w:eastAsia="宋体"/>
+        </w:rPr>
         <w:t>9.2 测试覆盖范围</w:t>
       </w:r>
     </w:p>
@@ -3051,6 +3829,9 @@
         <w:ind w:firstLine="425"/>
       </w:pPr>
       <w:r>
+        <w:rPr>
+          <w:rFonts w:ascii="Times New Roman" w:hAnsi="Times New Roman" w:eastAsia="宋体"/>
+        </w:rPr>
         <w:t>测试套件包含 21 项自动化测试用例，覆盖 scripts/llm_utils.py 中的两个核心纯函数：clean_llm_output 和 extract_sql。这两个函数是 LLM 输出处理管道的关键环节，任何回归缺陷都可能导致 SQL 解析失败或安全防护失效。</w:t>
       </w:r>
     </w:p>
@@ -3059,6 +3840,9 @@
         <w:pStyle w:val="Heading3"/>
       </w:pPr>
       <w:r>
+        <w:rPr>
+          <w:rFonts w:ascii="Times New Roman" w:hAnsi="Times New Roman" w:eastAsia="宋体"/>
+        </w:rPr>
         <w:t>9.2.1 clean_llm_output 测试（7 项）</w:t>
       </w:r>
     </w:p>
@@ -3067,6 +3851,9 @@
         <w:ind w:firstLine="425"/>
       </w:pPr>
       <w:r>
+        <w:rPr>
+          <w:rFonts w:ascii="Times New Roman" w:hAnsi="Times New Roman" w:eastAsia="宋体"/>
+        </w:rPr>
         <w:t>该函数负责清除 LLM 输出中的 think 标签，测试用例覆盖以下边界场景：</w:t>
       </w:r>
     </w:p>
@@ -3094,6 +3881,7 @@
             </w:pPr>
             <w:r>
               <w:rPr>
+                <w:rFonts w:ascii="Times New Roman" w:hAnsi="Times New Roman" w:eastAsia="宋体"/>
                 <w:b/>
               </w:rPr>
               <w:t>测试用例</w:t>
@@ -3110,6 +3898,7 @@
             </w:pPr>
             <w:r>
               <w:rPr>
+                <w:rFonts w:ascii="Times New Roman" w:hAnsi="Times New Roman" w:eastAsia="宋体"/>
                 <w:b/>
               </w:rPr>
               <w:t>输入</w:t>
@@ -3126,6 +3915,7 @@
             </w:pPr>
             <w:r>
               <w:rPr>
+                <w:rFonts w:ascii="Times New Roman" w:hAnsi="Times New Roman" w:eastAsia="宋体"/>
                 <w:b/>
               </w:rPr>
               <w:t>预期输出</w:t>
@@ -3142,6 +3932,7 @@
             </w:pPr>
             <w:r>
               <w:rPr>
+                <w:rFonts w:ascii="Times New Roman" w:hAnsi="Times New Roman" w:eastAsia="宋体"/>
                 <w:b/>
               </w:rPr>
               <w:t>验证点</w:t>
@@ -3156,6 +3947,9 @@
           </w:tcPr>
           <w:p>
             <w:r>
+              <w:rPr>
+                <w:rFonts w:ascii="Times New Roman" w:hAnsi="Times New Roman" w:eastAsia="宋体"/>
+              </w:rPr>
               <w:t>完整 think 块</w:t>
             </w:r>
           </w:p>
@@ -3166,6 +3960,9 @@
           </w:tcPr>
           <w:p>
             <w:r>
+              <w:rPr>
+                <w:rFonts w:ascii="Times New Roman" w:hAnsi="Times New Roman" w:eastAsia="宋体"/>
+              </w:rPr>
               <w:t>&lt;think&gt;thinking&lt;/think&gt;Hello</w:t>
             </w:r>
           </w:p>
@@ -3176,6 +3973,9 @@
           </w:tcPr>
           <w:p>
             <w:r>
+              <w:rPr>
+                <w:rFonts w:ascii="Times New Roman" w:hAnsi="Times New Roman" w:eastAsia="宋体"/>
+              </w:rPr>
               <w:t>Hello</w:t>
             </w:r>
           </w:p>
@@ -3186,6 +3986,9 @@
           </w:tcPr>
           <w:p>
             <w:r>
+              <w:rPr>
+                <w:rFonts w:ascii="Times New Roman" w:hAnsi="Times New Roman" w:eastAsia="宋体"/>
+              </w:rPr>
               <w:t>成对标签正确清除</w:t>
             </w:r>
           </w:p>
@@ -3198,6 +4001,9 @@
           </w:tcPr>
           <w:p>
             <w:r>
+              <w:rPr>
+                <w:rFonts w:ascii="Times New Roman" w:hAnsi="Times New Roman" w:eastAsia="宋体"/>
+              </w:rPr>
               <w:t>未闭合 think 标签</w:t>
             </w:r>
           </w:p>
@@ -3208,6 +4014,9 @@
           </w:tcPr>
           <w:p>
             <w:r>
+              <w:rPr>
+                <w:rFonts w:ascii="Times New Roman" w:hAnsi="Times New Roman" w:eastAsia="宋体"/>
+              </w:rPr>
               <w:t>&lt;think&gt;reasoning...&lt;/think&gt;World</w:t>
             </w:r>
           </w:p>
@@ -3218,6 +4027,9 @@
           </w:tcPr>
           <w:p>
             <w:r>
+              <w:rPr>
+                <w:rFonts w:ascii="Times New Roman" w:hAnsi="Times New Roman" w:eastAsia="宋体"/>
+              </w:rPr>
               <w:t>World</w:t>
             </w:r>
           </w:p>
@@ -3228,6 +4040,9 @@
           </w:tcPr>
           <w:p>
             <w:r>
+              <w:rPr>
+                <w:rFonts w:ascii="Times New Roman" w:hAnsi="Times New Roman" w:eastAsia="宋体"/>
+              </w:rPr>
               <w:t>标签对正确匹配</w:t>
             </w:r>
           </w:p>
@@ -3240,6 +4055,9 @@
           </w:tcPr>
           <w:p>
             <w:r>
+              <w:rPr>
+                <w:rFonts w:ascii="Times New Roman" w:hAnsi="Times New Roman" w:eastAsia="宋体"/>
+              </w:rPr>
               <w:t>多个 think 块</w:t>
             </w:r>
           </w:p>
@@ -3250,6 +4068,9 @@
           </w:tcPr>
           <w:p>
             <w:r>
+              <w:rPr>
+                <w:rFonts w:ascii="Times New Roman" w:hAnsi="Times New Roman" w:eastAsia="宋体"/>
+              </w:rPr>
               <w:t>&lt;think&gt;A&lt;/think&gt;&lt;think&gt;B&lt;/think&gt;Final</w:t>
             </w:r>
           </w:p>
@@ -3260,6 +4081,9 @@
           </w:tcPr>
           <w:p>
             <w:r>
+              <w:rPr>
+                <w:rFonts w:ascii="Times New Roman" w:hAnsi="Times New Roman" w:eastAsia="宋体"/>
+              </w:rPr>
               <w:t>Final</w:t>
             </w:r>
           </w:p>
@@ -3270,6 +4094,9 @@
           </w:tcPr>
           <w:p>
             <w:r>
+              <w:rPr>
+                <w:rFonts w:ascii="Times New Roman" w:hAnsi="Times New Roman" w:eastAsia="宋体"/>
+              </w:rPr>
               <w:t>多块嵌套处理</w:t>
             </w:r>
           </w:p>
@@ -3282,6 +4109,9 @@
           </w:tcPr>
           <w:p>
             <w:r>
+              <w:rPr>
+                <w:rFonts w:ascii="Times New Roman" w:hAnsi="Times New Roman" w:eastAsia="宋体"/>
+              </w:rPr>
               <w:t>纯文本无标签</w:t>
             </w:r>
           </w:p>
@@ -3292,6 +4122,9 @@
           </w:tcPr>
           <w:p>
             <w:r>
+              <w:rPr>
+                <w:rFonts w:ascii="Times New Roman" w:hAnsi="Times New Roman" w:eastAsia="宋体"/>
+              </w:rPr>
               <w:t>SELECT * FROM t</w:t>
             </w:r>
           </w:p>
@@ -3302,6 +4135,9 @@
           </w:tcPr>
           <w:p>
             <w:r>
+              <w:rPr>
+                <w:rFonts w:ascii="Times New Roman" w:hAnsi="Times New Roman" w:eastAsia="宋体"/>
+              </w:rPr>
               <w:t>SELECT * FROM t</w:t>
             </w:r>
           </w:p>
@@ -3312,6 +4148,9 @@
           </w:tcPr>
           <w:p>
             <w:r>
+              <w:rPr>
+                <w:rFonts w:ascii="Times New Roman" w:hAnsi="Times New Roman" w:eastAsia="宋体"/>
+              </w:rPr>
               <w:t>无标签时原样返回</w:t>
             </w:r>
           </w:p>
@@ -3324,6 +4163,9 @@
           </w:tcPr>
           <w:p>
             <w:r>
+              <w:rPr>
+                <w:rFonts w:ascii="Times New Roman" w:hAnsi="Times New Roman" w:eastAsia="宋体"/>
+              </w:rPr>
               <w:t>前后空白清理</w:t>
             </w:r>
           </w:p>
@@ -3334,6 +4176,9 @@
           </w:tcPr>
           <w:p>
             <w:r>
+              <w:rPr>
+                <w:rFonts w:ascii="Times New Roman" w:hAnsi="Times New Roman" w:eastAsia="宋体"/>
+              </w:rPr>
               <w:t xml:space="preserve">&lt;think&gt;x&lt;/think&gt; result </w:t>
             </w:r>
           </w:p>
@@ -3344,6 +4189,9 @@
           </w:tcPr>
           <w:p>
             <w:r>
+              <w:rPr>
+                <w:rFonts w:ascii="Times New Roman" w:hAnsi="Times New Roman" w:eastAsia="宋体"/>
+              </w:rPr>
               <w:t>result</w:t>
             </w:r>
           </w:p>
@@ -3354,6 +4202,9 @@
           </w:tcPr>
           <w:p>
             <w:r>
+              <w:rPr>
+                <w:rFonts w:ascii="Times New Roman" w:hAnsi="Times New Roman" w:eastAsia="宋体"/>
+              </w:rPr>
               <w:t>strip() 生效</w:t>
             </w:r>
           </w:p>
@@ -3366,6 +4217,9 @@
           </w:tcPr>
           <w:p>
             <w:r>
+              <w:rPr>
+                <w:rFonts w:ascii="Times New Roman" w:hAnsi="Times New Roman" w:eastAsia="宋体"/>
+              </w:rPr>
               <w:t>未闭合标签消费剩余</w:t>
             </w:r>
           </w:p>
@@ -3376,6 +4230,9 @@
           </w:tcPr>
           <w:p>
             <w:r>
+              <w:rPr>
+                <w:rFonts w:ascii="Times New Roman" w:hAnsi="Times New Roman" w:eastAsia="宋体"/>
+              </w:rPr>
               <w:t>&lt;think&gt;reasoning...Hello</w:t>
             </w:r>
           </w:p>
@@ -3385,7 +4242,11 @@
             <w:tcW w:type="dxa" w:w="2160"/>
           </w:tcPr>
           <w:p>
-            <w:r/>
+            <w:r>
+              <w:rPr>
+                <w:rFonts w:ascii="Times New Roman" w:hAnsi="Times New Roman" w:eastAsia="宋体"/>
+              </w:rPr>
+            </w:r>
           </w:p>
         </w:tc>
         <w:tc>
@@ -3394,6 +4255,9 @@
           </w:tcPr>
           <w:p>
             <w:r>
+              <w:rPr>
+                <w:rFonts w:ascii="Times New Roman" w:hAnsi="Times New Roman" w:eastAsia="宋体"/>
+              </w:rPr>
               <w:t>贪婪匹配行为</w:t>
             </w:r>
           </w:p>
@@ -3406,6 +4270,9 @@
           </w:tcPr>
           <w:p>
             <w:r>
+              <w:rPr>
+                <w:rFonts w:ascii="Times New Roman" w:hAnsi="Times New Roman" w:eastAsia="宋体"/>
+              </w:rPr>
               <w:t>完整 think 块+内容</w:t>
             </w:r>
           </w:p>
@@ -3416,6 +4283,9 @@
           </w:tcPr>
           <w:p>
             <w:r>
+              <w:rPr>
+                <w:rFonts w:ascii="Times New Roman" w:hAnsi="Times New Roman" w:eastAsia="宋体"/>
+              </w:rPr>
               <w:t>&lt;think&gt;分析&lt;/think&gt;结果</w:t>
             </w:r>
           </w:p>
@@ -3426,6 +4296,9 @@
           </w:tcPr>
           <w:p>
             <w:r>
+              <w:rPr>
+                <w:rFonts w:ascii="Times New Roman" w:hAnsi="Times New Roman" w:eastAsia="宋体"/>
+              </w:rPr>
               <w:t>结果</w:t>
             </w:r>
           </w:p>
@@ -3436,6 +4309,9 @@
           </w:tcPr>
           <w:p>
             <w:r>
+              <w:rPr>
+                <w:rFonts w:ascii="Times New Roman" w:hAnsi="Times New Roman" w:eastAsia="宋体"/>
+              </w:rPr>
               <w:t>保留非 think 内容</w:t>
             </w:r>
           </w:p>
@@ -3447,6 +4323,9 @@
         <w:pStyle w:val="Heading3"/>
       </w:pPr>
       <w:r>
+        <w:rPr>
+          <w:rFonts w:ascii="Times New Roman" w:hAnsi="Times New Roman" w:eastAsia="宋体"/>
+        </w:rPr>
         <w:t>9.2.2 extract_sql 测试（14 项）</w:t>
       </w:r>
     </w:p>
@@ -3455,6 +4334,9 @@
         <w:ind w:firstLine="425"/>
       </w:pPr>
       <w:r>
+        <w:rPr>
+          <w:rFonts w:ascii="Times New Roman" w:hAnsi="Times New Roman" w:eastAsia="宋体"/>
+        </w:rPr>
         <w:t>该函数负责从 LLM 输出中提取纯净 SQL，测试用例覆盖以下场景：</w:t>
       </w:r>
     </w:p>
@@ -3481,6 +4363,7 @@
             </w:pPr>
             <w:r>
               <w:rPr>
+                <w:rFonts w:ascii="Times New Roman" w:hAnsi="Times New Roman" w:eastAsia="宋体"/>
                 <w:b/>
               </w:rPr>
               <w:t>测试场景</w:t>
@@ -3497,6 +4380,7 @@
             </w:pPr>
             <w:r>
               <w:rPr>
+                <w:rFonts w:ascii="Times New Roman" w:hAnsi="Times New Roman" w:eastAsia="宋体"/>
                 <w:b/>
               </w:rPr>
               <w:t>用例数</w:t>
@@ -3513,6 +4397,7 @@
             </w:pPr>
             <w:r>
               <w:rPr>
+                <w:rFonts w:ascii="Times New Roman" w:hAnsi="Times New Roman" w:eastAsia="宋体"/>
                 <w:b/>
               </w:rPr>
               <w:t>覆盖内容</w:t>
@@ -3527,6 +4412,9 @@
           </w:tcPr>
           <w:p>
             <w:r>
+              <w:rPr>
+                <w:rFonts w:ascii="Times New Roman" w:hAnsi="Times New Roman" w:eastAsia="宋体"/>
+              </w:rPr>
               <w:t>Markdown 代码块提取</w:t>
             </w:r>
           </w:p>
@@ -3537,6 +4425,9 @@
           </w:tcPr>
           <w:p>
             <w:r>
+              <w:rPr>
+                <w:rFonts w:ascii="Times New Roman" w:hAnsi="Times New Roman" w:eastAsia="宋体"/>
+              </w:rPr>
               <w:t>2</w:t>
             </w:r>
           </w:p>
@@ -3547,6 +4438,9 @@
           </w:tcPr>
           <w:p>
             <w:r>
+              <w:rPr>
+                <w:rFonts w:ascii="Times New Roman" w:hAnsi="Times New Roman" w:eastAsia="宋体"/>
+              </w:rPr>
               <w:t>带语言标记（```sql）和不带标记（```）两种格式</w:t>
             </w:r>
           </w:p>
@@ -3559,6 +4453,9 @@
           </w:tcPr>
           <w:p>
             <w:r>
+              <w:rPr>
+                <w:rFonts w:ascii="Times New Roman" w:hAnsi="Times New Roman" w:eastAsia="宋体"/>
+              </w:rPr>
               <w:t>纯 SQL 文本</w:t>
             </w:r>
           </w:p>
@@ -3569,6 +4466,9 @@
           </w:tcPr>
           <w:p>
             <w:r>
+              <w:rPr>
+                <w:rFonts w:ascii="Times New Roman" w:hAnsi="Times New Roman" w:eastAsia="宋体"/>
+              </w:rPr>
               <w:t>2</w:t>
             </w:r>
           </w:p>
@@ -3579,6 +4479,9 @@
           </w:tcPr>
           <w:p>
             <w:r>
+              <w:rPr>
+                <w:rFonts w:ascii="Times New Roman" w:hAnsi="Times New Roman" w:eastAsia="宋体"/>
+              </w:rPr>
               <w:t>直接 SELECT 和 WITH CTE 语法</w:t>
             </w:r>
           </w:p>
@@ -3591,6 +4494,9 @@
           </w:tcPr>
           <w:p>
             <w:r>
+              <w:rPr>
+                <w:rFonts w:ascii="Times New Roman" w:hAnsi="Times New Roman" w:eastAsia="宋体"/>
+              </w:rPr>
               <w:t>注释清除</w:t>
             </w:r>
           </w:p>
@@ -3601,6 +4507,9 @@
           </w:tcPr>
           <w:p>
             <w:r>
+              <w:rPr>
+                <w:rFonts w:ascii="Times New Roman" w:hAnsi="Times New Roman" w:eastAsia="宋体"/>
+              </w:rPr>
               <w:t>2</w:t>
             </w:r>
           </w:p>
@@ -3611,6 +4520,9 @@
           </w:tcPr>
           <w:p>
             <w:r>
+              <w:rPr>
+                <w:rFonts w:ascii="Times New Roman" w:hAnsi="Times New Roman" w:eastAsia="宋体"/>
+              </w:rPr>
               <w:t>单行注释（--）和块注释（/* */）</w:t>
             </w:r>
           </w:p>
@@ -3623,6 +4535,9 @@
           </w:tcPr>
           <w:p>
             <w:r>
+              <w:rPr>
+                <w:rFonts w:ascii="Times New Roman" w:hAnsi="Times New Roman" w:eastAsia="宋体"/>
+              </w:rPr>
               <w:t>think 标签 + SQL 组合</w:t>
             </w:r>
           </w:p>
@@ -3633,6 +4548,9 @@
           </w:tcPr>
           <w:p>
             <w:r>
+              <w:rPr>
+                <w:rFonts w:ascii="Times New Roman" w:hAnsi="Times New Roman" w:eastAsia="宋体"/>
+              </w:rPr>
               <w:t>1</w:t>
             </w:r>
           </w:p>
@@ -3643,6 +4561,9 @@
           </w:tcPr>
           <w:p>
             <w:r>
+              <w:rPr>
+                <w:rFonts w:ascii="Times New Roman" w:hAnsi="Times New Roman" w:eastAsia="宋体"/>
+              </w:rPr>
               <w:t>think 块后跟 SQL 代码块</w:t>
             </w:r>
           </w:p>
@@ -3655,6 +4576,9 @@
           </w:tcPr>
           <w:p>
             <w:r>
+              <w:rPr>
+                <w:rFonts w:ascii="Times New Roman" w:hAnsi="Times New Roman" w:eastAsia="宋体"/>
+              </w:rPr>
               <w:t>OR 链截断</w:t>
             </w:r>
           </w:p>
@@ -3665,6 +4589,9 @@
           </w:tcPr>
           <w:p>
             <w:r>
+              <w:rPr>
+                <w:rFonts w:ascii="Times New Roman" w:hAnsi="Times New Roman" w:eastAsia="宋体"/>
+              </w:rPr>
               <w:t>2</w:t>
             </w:r>
           </w:p>
@@ -3675,6 +4602,9 @@
           </w:tcPr>
           <w:p>
             <w:r>
+              <w:rPr>
+                <w:rFonts w:ascii="Times New Roman" w:hAnsi="Times New Roman" w:eastAsia="宋体"/>
+              </w:rPr>
               <w:t>超过 10 个 OR 时截断并添加 LIMIT；不超过时保留</w:t>
             </w:r>
           </w:p>
@@ -3687,6 +4617,9 @@
           </w:tcPr>
           <w:p>
             <w:r>
+              <w:rPr>
+                <w:rFonts w:ascii="Times New Roman" w:hAnsi="Times New Roman" w:eastAsia="宋体"/>
+              </w:rPr>
               <w:t>SQL 长度截断</w:t>
             </w:r>
           </w:p>
@@ -3697,6 +4630,9 @@
           </w:tcPr>
           <w:p>
             <w:r>
+              <w:rPr>
+                <w:rFonts w:ascii="Times New Roman" w:hAnsi="Times New Roman" w:eastAsia="宋体"/>
+              </w:rPr>
               <w:t>1</w:t>
             </w:r>
           </w:p>
@@ -3707,6 +4643,9 @@
           </w:tcPr>
           <w:p>
             <w:r>
+              <w:rPr>
+                <w:rFonts w:ascii="Times New Roman" w:hAnsi="Times New Roman" w:eastAsia="宋体"/>
+              </w:rPr>
               <w:t>超过 1500 字符时自动截断</w:t>
             </w:r>
           </w:p>
@@ -3719,6 +4658,9 @@
           </w:tcPr>
           <w:p>
             <w:r>
+              <w:rPr>
+                <w:rFonts w:ascii="Times New Roman" w:hAnsi="Times New Roman" w:eastAsia="宋体"/>
+              </w:rPr>
               <w:t>分号清除</w:t>
             </w:r>
           </w:p>
@@ -3729,6 +4671,9 @@
           </w:tcPr>
           <w:p>
             <w:r>
+              <w:rPr>
+                <w:rFonts w:ascii="Times New Roman" w:hAnsi="Times New Roman" w:eastAsia="宋体"/>
+              </w:rPr>
               <w:t>1</w:t>
             </w:r>
           </w:p>
@@ -3739,6 +4684,9 @@
           </w:tcPr>
           <w:p>
             <w:r>
+              <w:rPr>
+                <w:rFonts w:ascii="Times New Roman" w:hAnsi="Times New Roman" w:eastAsia="宋体"/>
+              </w:rPr>
               <w:t>尾部分号被移除</w:t>
             </w:r>
           </w:p>
@@ -3751,6 +4699,9 @@
           </w:tcPr>
           <w:p>
             <w:r>
+              <w:rPr>
+                <w:rFonts w:ascii="Times New Roman" w:hAnsi="Times New Roman" w:eastAsia="宋体"/>
+              </w:rPr>
               <w:t>空输入处理</w:t>
             </w:r>
           </w:p>
@@ -3761,6 +4712,9 @@
           </w:tcPr>
           <w:p>
             <w:r>
+              <w:rPr>
+                <w:rFonts w:ascii="Times New Roman" w:hAnsi="Times New Roman" w:eastAsia="宋体"/>
+              </w:rPr>
               <w:t>1</w:t>
             </w:r>
           </w:p>
@@ -3771,6 +4725,9 @@
           </w:tcPr>
           <w:p>
             <w:r>
+              <w:rPr>
+                <w:rFonts w:ascii="Times New Roman" w:hAnsi="Times New Roman" w:eastAsia="宋体"/>
+              </w:rPr>
               <w:t>空字符串返回空字符串</w:t>
             </w:r>
           </w:p>
@@ -3783,6 +4740,9 @@
           </w:tcPr>
           <w:p>
             <w:r>
+              <w:rPr>
+                <w:rFonts w:ascii="Times New Roman" w:hAnsi="Times New Roman" w:eastAsia="宋体"/>
+              </w:rPr>
               <w:t>噪声文本过滤</w:t>
             </w:r>
           </w:p>
@@ -3793,6 +4753,9 @@
           </w:tcPr>
           <w:p>
             <w:r>
+              <w:rPr>
+                <w:rFonts w:ascii="Times New Roman" w:hAnsi="Times New Roman" w:eastAsia="宋体"/>
+              </w:rPr>
               <w:t>1</w:t>
             </w:r>
           </w:p>
@@ -3803,6 +4766,9 @@
           </w:tcPr>
           <w:p>
             <w:r>
+              <w:rPr>
+                <w:rFonts w:ascii="Times New Roman" w:hAnsi="Times New Roman" w:eastAsia="宋体"/>
+              </w:rPr>
               <w:t>SQL 前的自然语言描述被跳过</w:t>
             </w:r>
           </w:p>
@@ -3815,6 +4781,9 @@
           </w:tcPr>
           <w:p>
             <w:r>
+              <w:rPr>
+                <w:rFonts w:ascii="Times New Roman" w:hAnsi="Times New Roman" w:eastAsia="宋体"/>
+              </w:rPr>
               <w:t>Markdown + 周围文本</w:t>
             </w:r>
           </w:p>
@@ -3825,6 +4794,9 @@
           </w:tcPr>
           <w:p>
             <w:r>
+              <w:rPr>
+                <w:rFonts w:ascii="Times New Roman" w:hAnsi="Times New Roman" w:eastAsia="宋体"/>
+              </w:rPr>
               <w:t>1</w:t>
             </w:r>
           </w:p>
@@ -3835,6 +4807,9 @@
           </w:tcPr>
           <w:p>
             <w:r>
+              <w:rPr>
+                <w:rFonts w:ascii="Times New Roman" w:hAnsi="Times New Roman" w:eastAsia="宋体"/>
+              </w:rPr>
               <w:t>SQL 代码块夹在自然语言中间</w:t>
             </w:r>
           </w:p>
@@ -3846,6 +4821,9 @@
         <w:pStyle w:val="Heading2"/>
       </w:pPr>
       <w:r>
+        <w:rPr>
+          <w:rFonts w:ascii="Times New Roman" w:hAnsi="Times New Roman" w:eastAsia="宋体"/>
+        </w:rPr>
         <w:t>9.3 测试执行结果</w:t>
       </w:r>
     </w:p>
@@ -3854,6 +4832,9 @@
         <w:ind w:firstLine="425"/>
       </w:pPr>
       <w:r>
+        <w:rPr>
+          <w:rFonts w:ascii="Times New Roman" w:hAnsi="Times New Roman" w:eastAsia="宋体"/>
+        </w:rPr>
         <w:t>所有 21 项测试用例均通过，执行耗时约 0.002 秒：</w:t>
       </w:r>
     </w:p>
@@ -3863,7 +4844,7 @@
       </w:pPr>
       <w:r>
         <w:rPr>
-          <w:rFonts w:ascii="Courier New" w:hAnsi="Courier New"/>
+          <w:rFonts w:ascii="Times New Roman" w:hAnsi="Times New Roman" w:eastAsia="宋体"/>
           <w:sz w:val="18"/>
         </w:rPr>
         <w:t>test_strips_think_tags ............... ok</w:t>
@@ -3918,6 +4899,9 @@
         <w:pStyle w:val="Heading2"/>
       </w:pPr>
       <w:r>
+        <w:rPr>
+          <w:rFonts w:ascii="Times New Roman" w:hAnsi="Times New Roman" w:eastAsia="宋体"/>
+        </w:rPr>
         <w:t>9.4 测试保障的意义</w:t>
       </w:r>
     </w:p>
@@ -3926,6 +4910,9 @@
         <w:ind w:firstLine="425"/>
       </w:pPr>
       <w:r>
+        <w:rPr>
+          <w:rFonts w:ascii="Times New Roman" w:hAnsi="Times New Roman" w:eastAsia="宋体"/>
+        </w:rPr>
         <w:t>自动化单元测试为系统提供了以下健壮性保障：</w:t>
         <w:br/>
         <w:t>（1）回归安全：当修改 SQL 解析逻辑时，测试套件可立即发现破坏性变更；</w:t>
@@ -3939,6 +4926,9 @@
     </w:p>
     <w:p>
       <w:r>
+        <w:rPr>
+          <w:rFonts w:ascii="Times New Roman" w:hAnsi="Times New Roman" w:eastAsia="宋体"/>
+        </w:rPr>
         <w:br w:type="page"/>
       </w:r>
     </w:p>
@@ -3947,6 +4937,9 @@
         <w:pStyle w:val="Heading1"/>
       </w:pPr>
       <w:r>
+        <w:rPr>
+          <w:rFonts w:ascii="Times New Roman" w:hAnsi="Times New Roman" w:eastAsia="宋体"/>
+        </w:rPr>
         <w:t>十、总结与心得</w:t>
       </w:r>
     </w:p>
@@ -3955,6 +4948,9 @@
         <w:ind w:firstLine="425"/>
       </w:pPr>
       <w:r>
+        <w:rPr>
+          <w:rFonts w:ascii="Times New Roman" w:hAnsi="Times New Roman" w:eastAsia="宋体"/>
+        </w:rPr>
         <w:t>本项目综合运用了 Python 数据处理、SQLite 数据库设计、LangChain 大模型框架和 Streamlit Web 开发技术，实现了一个能够回答自然语言分析问题的数据智能体。通过本次实践，我们深入理解了 NL-to-SQL 的完整技术链路，包括数据库建模、Prompt 工程、SQL 安全防护和数据可视化等关键环节。</w:t>
       </w:r>
     </w:p>
@@ -3963,6 +4959,9 @@
         <w:ind w:firstLine="425"/>
       </w:pPr>
       <w:r>
+        <w:rPr>
+          <w:rFonts w:ascii="Times New Roman" w:hAnsi="Times New Roman" w:eastAsia="宋体"/>
+        </w:rPr>
         <w:t>项目的主要技术亮点包括：</w:t>
         <w:br/>
         <w:t>（1）双层语义防火墙：通过提示词约束 + 运行时关键字拦截，双重保障数据库安全；</w:t>
@@ -3978,6 +4977,9 @@
     </w:p>
     <w:p>
       <w:r>
+        <w:rPr>
+          <w:rFonts w:ascii="Times New Roman" w:hAnsi="Times New Roman" w:eastAsia="宋体"/>
+        </w:rPr>
         <w:br w:type="page"/>
       </w:r>
     </w:p>
@@ -3986,6 +4988,9 @@
         <w:pStyle w:val="Heading1"/>
       </w:pPr>
       <w:r>
+        <w:rPr>
+          <w:rFonts w:ascii="Times New Roman" w:hAnsi="Times New Roman" w:eastAsia="宋体"/>
+        </w:rPr>
         <w:t>附录</w:t>
       </w:r>
     </w:p>
@@ -3994,6 +4999,9 @@
         <w:pStyle w:val="Heading2"/>
       </w:pPr>
       <w:r>
+        <w:rPr>
+          <w:rFonts w:ascii="Times New Roman" w:hAnsi="Times New Roman" w:eastAsia="宋体"/>
+        </w:rPr>
         <w:t>附录 A：项目文件清单</w:t>
       </w:r>
     </w:p>
@@ -4019,6 +5027,7 @@
             </w:pPr>
             <w:r>
               <w:rPr>
+                <w:rFonts w:ascii="Times New Roman" w:hAnsi="Times New Roman" w:eastAsia="宋体"/>
                 <w:b/>
               </w:rPr>
               <w:t>文件名</w:t>
@@ -4035,6 +5044,7 @@
             </w:pPr>
             <w:r>
               <w:rPr>
+                <w:rFonts w:ascii="Times New Roman" w:hAnsi="Times New Roman" w:eastAsia="宋体"/>
                 <w:b/>
               </w:rPr>
               <w:t>说明</w:t>
@@ -4049,6 +5059,9 @@
           </w:tcPr>
           <w:p>
             <w:r>
+              <w:rPr>
+                <w:rFonts w:ascii="Times New Roman" w:hAnsi="Times New Roman" w:eastAsia="宋体"/>
+              </w:rPr>
               <w:t>app.py</w:t>
             </w:r>
           </w:p>
@@ -4059,6 +5072,9 @@
           </w:tcPr>
           <w:p>
             <w:r>
+              <w:rPr>
+                <w:rFonts w:ascii="Times New Roman" w:hAnsi="Times New Roman" w:eastAsia="宋体"/>
+              </w:rPr>
               <w:t>Streamlit Web UI 主程序</w:t>
             </w:r>
           </w:p>
@@ -4071,6 +5087,9 @@
           </w:tcPr>
           <w:p>
             <w:r>
+              <w:rPr>
+                <w:rFonts w:ascii="Times New Roman" w:hAnsi="Times New Roman" w:eastAsia="宋体"/>
+              </w:rPr>
               <w:t>scripts/llm_utils.py</w:t>
             </w:r>
           </w:p>
@@ -4081,6 +5100,9 @@
           </w:tcPr>
           <w:p>
             <w:r>
+              <w:rPr>
+                <w:rFonts w:ascii="Times New Roman" w:hAnsi="Times New Roman" w:eastAsia="宋体"/>
+              </w:rPr>
               <w:t>共享 LLM/SQL 工具函数（中心化工具层）</w:t>
             </w:r>
           </w:p>
@@ -4093,6 +5115,9 @@
           </w:tcPr>
           <w:p>
             <w:r>
+              <w:rPr>
+                <w:rFonts w:ascii="Times New Roman" w:hAnsi="Times New Roman" w:eastAsia="宋体"/>
+              </w:rPr>
               <w:t>scripts/data_agent.py</w:t>
             </w:r>
           </w:p>
@@ -4103,6 +5128,9 @@
           </w:tcPr>
           <w:p>
             <w:r>
+              <w:rPr>
+                <w:rFonts w:ascii="Times New Roman" w:hAnsi="Times New Roman" w:eastAsia="宋体"/>
+              </w:rPr>
               <w:t>CLI 版数据智能体</w:t>
             </w:r>
           </w:p>
@@ -4115,6 +5143,9 @@
           </w:tcPr>
           <w:p>
             <w:r>
+              <w:rPr>
+                <w:rFonts w:ascii="Times New Roman" w:hAnsi="Times New Roman" w:eastAsia="宋体"/>
+              </w:rPr>
               <w:t>scripts/init_db.py</w:t>
             </w:r>
           </w:p>
@@ -4125,6 +5156,9 @@
           </w:tcPr>
           <w:p>
             <w:r>
+              <w:rPr>
+                <w:rFonts w:ascii="Times New Roman" w:hAnsi="Times New Roman" w:eastAsia="宋体"/>
+              </w:rPr>
               <w:t>数据导入与建库脚本</w:t>
             </w:r>
           </w:p>
@@ -4137,6 +5171,9 @@
           </w:tcPr>
           <w:p>
             <w:r>
+              <w:rPr>
+                <w:rFonts w:ascii="Times New Roman" w:hAnsi="Times New Roman" w:eastAsia="宋体"/>
+              </w:rPr>
               <w:t>tests/test_llm_utils.py</w:t>
             </w:r>
           </w:p>
@@ -4147,6 +5184,9 @@
           </w:tcPr>
           <w:p>
             <w:r>
+              <w:rPr>
+                <w:rFonts w:ascii="Times New Roman" w:hAnsi="Times New Roman" w:eastAsia="宋体"/>
+              </w:rPr>
               <w:t>单元测试（21 项）</w:t>
             </w:r>
           </w:p>
@@ -4159,6 +5199,9 @@
           </w:tcPr>
           <w:p>
             <w:r>
+              <w:rPr>
+                <w:rFonts w:ascii="Times New Roman" w:hAnsi="Times New Roman" w:eastAsia="宋体"/>
+              </w:rPr>
               <w:t>requirements.txt</w:t>
             </w:r>
           </w:p>
@@ -4169,6 +5212,9 @@
           </w:tcPr>
           <w:p>
             <w:r>
+              <w:rPr>
+                <w:rFonts w:ascii="Times New Roman" w:hAnsi="Times New Roman" w:eastAsia="宋体"/>
+              </w:rPr>
               <w:t>Python 依赖清单</w:t>
             </w:r>
           </w:p>
@@ -4181,6 +5227,9 @@
           </w:tcPr>
           <w:p>
             <w:r>
+              <w:rPr>
+                <w:rFonts w:ascii="Times New Roman" w:hAnsi="Times New Roman" w:eastAsia="宋体"/>
+              </w:rPr>
               <w:t>.env.example</w:t>
             </w:r>
           </w:p>
@@ -4191,6 +5240,9 @@
           </w:tcPr>
           <w:p>
             <w:r>
+              <w:rPr>
+                <w:rFonts w:ascii="Times New Roman" w:hAnsi="Times New Roman" w:eastAsia="宋体"/>
+              </w:rPr>
               <w:t>环境变量模板</w:t>
             </w:r>
           </w:p>
@@ -4203,6 +5255,9 @@
           </w:tcPr>
           <w:p>
             <w:r>
+              <w:rPr>
+                <w:rFonts w:ascii="Times New Roman" w:hAnsi="Times New Roman" w:eastAsia="宋体"/>
+              </w:rPr>
               <w:t>data/ai_jobs_market_2025_2026.csv</w:t>
             </w:r>
           </w:p>
@@ -4213,6 +5268,9 @@
           </w:tcPr>
           <w:p>
             <w:r>
+              <w:rPr>
+                <w:rFonts w:ascii="Times New Roman" w:hAnsi="Times New Roman" w:eastAsia="宋体"/>
+              </w:rPr>
               <w:t>原始数据集</w:t>
             </w:r>
           </w:p>
@@ -4225,6 +5283,9 @@
           </w:tcPr>
           <w:p>
             <w:r>
+              <w:rPr>
+                <w:rFonts w:ascii="Times New Roman" w:hAnsi="Times New Roman" w:eastAsia="宋体"/>
+              </w:rPr>
               <w:t>db/ai_jobs.db</w:t>
             </w:r>
           </w:p>
@@ -4235,6 +5296,9 @@
           </w:tcPr>
           <w:p>
             <w:r>
+              <w:rPr>
+                <w:rFonts w:ascii="Times New Roman" w:hAnsi="Times New Roman" w:eastAsia="宋体"/>
+              </w:rPr>
               <w:t>SQLite 数据库文件</w:t>
             </w:r>
           </w:p>
@@ -4246,6 +5310,9 @@
         <w:pStyle w:val="Heading2"/>
       </w:pPr>
       <w:r>
+        <w:rPr>
+          <w:rFonts w:ascii="Times New Roman" w:hAnsi="Times New Roman" w:eastAsia="宋体"/>
+        </w:rPr>
         <w:t>附录 B：ER 关系图</w:t>
       </w:r>
     </w:p>
@@ -4254,6 +5321,9 @@
         <w:ind w:firstLine="425"/>
       </w:pPr>
       <w:r>
+        <w:rPr>
+          <w:rFonts w:ascii="Times New Roman" w:hAnsi="Times New Roman" w:eastAsia="宋体"/>
+        </w:rPr>
         <w:t>【此处插入 ER 图】</w:t>
       </w:r>
     </w:p>
@@ -4262,6 +5332,9 @@
         <w:ind w:firstLine="425"/>
       </w:pPr>
       <w:r>
+        <w:rPr>
+          <w:rFonts w:ascii="Times New Roman" w:hAnsi="Times New Roman" w:eastAsia="宋体"/>
+        </w:rPr>
         <w:t>job_postings.job_id &lt;--&gt; job_skills.job_id（一对多关系）</w:t>
         <w:br/>
         <w:t>job_categories.category &lt;-- 基于 job_postings.job_category 聚合</w:t>
@@ -4272,6 +5345,8 @@
       </w:r>
     </w:p>
     <w:sectPr>
+      <w:headerReference w:type="default" r:id="rId9"/>
+      <w:footerReference w:type="default" r:id="rId10"/>
       <w:pgSz w:w="12240" w:h="15840"/>
       <w:pgMar w:top="1440" w:right="1800" w:bottom="1440" w:left="1800" w:header="720" w:footer="720" w:gutter="0"/>
       <w:cols w:space="720"/>
@@ -4279,6 +5354,26 @@
     </w:sectPr>
   </w:body>
 </w:document>
+</file>
+
+<file path=word/footer1.xml><?xml version="1.0" encoding="utf-8"?>
+<w:ftr xmlns:m="http://schemas.openxmlformats.org/officeDocument/2006/math" xmlns:mc="http://schemas.openxmlformats.org/markup-compatibility/2006" xmlns:mo="http://schemas.microsoft.com/office/mac/office/2008/main" xmlns:mv="urn:schemas-microsoft-com:mac:vml" xmlns:o="urn:schemas-microsoft-com:office:office" xmlns:r="http://schemas.openxmlformats.org/officeDocument/2006/relationships" xmlns:v="urn:schemas-microsoft-com:vml" xmlns:w10="urn:schemas-microsoft-com:office:word" xmlns:w14="http://schemas.microsoft.com/office/word/2010/wordml" xmlns:w="http://schemas.openxmlformats.org/wordprocessingml/2006/main" xmlns:wne="http://schemas.microsoft.com/office/word/2006/wordml" xmlns:wp14="http://schemas.microsoft.com/office/word/2010/wordprocessingDrawing" xmlns:wp="http://schemas.openxmlformats.org/drawingml/2006/wordprocessingDrawing" xmlns:wpc="http://schemas.microsoft.com/office/word/2010/wordprocessingCanvas" xmlns:wpg="http://schemas.microsoft.com/office/word/2010/wordprocessingGroup" xmlns:wpi="http://schemas.microsoft.com/office/word/2010/wordprocessingInk" xmlns:wps="http://schemas.microsoft.com/office/word/2010/wordprocessingShape" mc:Ignorable="w14 wp14">
+  <w:p>
+    <w:pPr>
+      <w:pStyle w:val="Footer"/>
+    </w:pPr>
+  </w:p>
+</w:ftr>
+</file>
+
+<file path=word/header1.xml><?xml version="1.0" encoding="utf-8"?>
+<w:hdr xmlns:m="http://schemas.openxmlformats.org/officeDocument/2006/math" xmlns:mc="http://schemas.openxmlformats.org/markup-compatibility/2006" xmlns:mo="http://schemas.microsoft.com/office/mac/office/2008/main" xmlns:mv="urn:schemas-microsoft-com:mac:vml" xmlns:o="urn:schemas-microsoft-com:office:office" xmlns:r="http://schemas.openxmlformats.org/officeDocument/2006/relationships" xmlns:v="urn:schemas-microsoft-com:vml" xmlns:w10="urn:schemas-microsoft-com:office:word" xmlns:w14="http://schemas.microsoft.com/office/word/2010/wordml" xmlns:w="http://schemas.openxmlformats.org/wordprocessingml/2006/main" xmlns:wne="http://schemas.microsoft.com/office/word/2006/wordml" xmlns:wp14="http://schemas.microsoft.com/office/word/2010/wordprocessingDrawing" xmlns:wp="http://schemas.openxmlformats.org/drawingml/2006/wordprocessingDrawing" xmlns:wpc="http://schemas.microsoft.com/office/word/2010/wordprocessingCanvas" xmlns:wpg="http://schemas.microsoft.com/office/word/2010/wordprocessingGroup" xmlns:wpi="http://schemas.microsoft.com/office/word/2010/wordprocessingInk" xmlns:wps="http://schemas.microsoft.com/office/word/2010/wordprocessingShape" mc:Ignorable="w14 wp14">
+  <w:p>
+    <w:pPr>
+      <w:pStyle w:val="Header"/>
+    </w:pPr>
+  </w:p>
+</w:hdr>
 </file>
 
 <file path=word/numbering.xml><?xml version="1.0" encoding="utf-8"?>

</xml_diff>

<commit_message>
polish data agent for submission
</commit_message>
<xml_diff>
--- a/实验报告_数据分析智能体.docx
+++ b/实验报告_数据分析智能体.docx
@@ -274,7 +274,7 @@
         <w:rPr>
           <w:rFonts w:ascii="Times New Roman" w:hAnsi="Times New Roman" w:eastAsia="宋体"/>
         </w:rPr>
-        <w:t>双层语义防火墙：LLM 输出解析 + 运行时 SQL 关键字拦截，双重保障数据库安全</w:t>
+        <w:t>只读 SQL 防护：LLM 输出解析 + 运行时只读校验，拒绝写入和结构修改语句</w:t>
       </w:r>
     </w:p>
     <w:p>
@@ -285,7 +285,7 @@
         <w:rPr>
           <w:rFonts w:ascii="Times New Roman" w:hAnsi="Times New Roman" w:eastAsia="宋体"/>
         </w:rPr>
-        <w:t>21 项自动化单元测试：确保核心解析函数 100% 回归安全</w:t>
+        <w:t>自动化测试：覆盖 SQL 输出解析、只读校验、幂等建库和预置查询</w:t>
       </w:r>
     </w:p>
     <w:p>
@@ -653,7 +653,7 @@
         <w:rPr>
           <w:rFonts w:ascii="Times New Roman" w:hAnsi="Times New Roman" w:eastAsia="宋体"/>
         </w:rPr>
-        <w:t>2.3 智能建库、防重复 I/O 与自适应幂等性保障</w:t>
+        <w:t>2.3 幂等建库与强制重建机制</w:t>
       </w:r>
     </w:p>
     <w:p>
@@ -664,7 +664,7 @@
         <w:rPr>
           <w:rFonts w:ascii="Times New Roman" w:hAnsi="Times New Roman" w:eastAsia="宋体"/>
         </w:rPr>
-        <w:t>系统对关系数据库的初始化脚本 scripts/init_db.py 进行了全方位的工业级硬化设计，抛弃了传统"盲目删库重建"的高能耗、高风险方案，实现了基于状态检测的自适应增量幂等性底座。</w:t>
+        <w:t>系统对关系数据库初始化脚本 scripts/init_db.py 增加了状态检测。默认情况下，如果 db/ai_jobs.db 已存在且 job_postings 表中已有数据，脚本会跳过重建，避免开发和演示过程中反复写入数据库。</w:t>
       </w:r>
     </w:p>
     <w:p>
@@ -708,7 +708,7 @@
         <w:rPr>
           <w:rFonts w:ascii="Times New Roman" w:hAnsi="Times New Roman" w:eastAsia="宋体"/>
         </w:rPr>
-        <w:t>当检测到数据库已初始化且数据完备时，系统会自动终止后续的高密集型 CSV 解析与写盘操作，输出提示："Database already initialized with data. Skipping full recreation." 并安全退出。这在频繁重启开发环境或多用户并发部署时，彻底杜绝了重复 I/O 导致的磁盘磨损与数据二次污染。</w:t>
+        <w:t>当检测到数据库已初始化且数据完备时，系统会跳过后续 CSV 解析和写盘操作，输出提示："Database already initialized with data. Skipping full recreation." 并安全退出。如果需要重新从 CSV 构建数据库，可以使用 --force 参数显式重建。</w:t>
       </w:r>
     </w:p>
     <w:p>
@@ -719,7 +719,7 @@
         <w:rPr>
           <w:rFonts w:ascii="Times New Roman" w:hAnsi="Times New Roman" w:eastAsia="宋体"/>
         </w:rPr>
-        <w:t>（3）带后门的安全覆写机制（--force）：</w:t>
+        <w:t>（3）强制重建机制（--force）：</w:t>
       </w:r>
     </w:p>
     <w:p>
@@ -730,7 +730,7 @@
         <w:rPr>
           <w:rFonts w:ascii="Times New Roman" w:hAnsi="Times New Roman" w:eastAsia="宋体"/>
         </w:rPr>
-        <w:t>为了同时满足"生产环境防误删"与"开发环境重洗数据"的双重需求，脚本引入了命令行参数解析器。只有当显式传入 --force 标志时，系统才会执行全量擦除重建，完美兼顾了自动化部署的安全性与调试的灵活性。</w:t>
+        <w:t>为了在需要更新数据或重新生成索引时保留调试入口，脚本提供 --force 参数。只有显式传入该参数时，系统才会重新读取 CSV 并覆盖生成 db/ai_jobs.db。</w:t>
       </w:r>
     </w:p>
     <w:p>
@@ -1299,7 +1299,7 @@
         <w:br/>
         <w:t xml:space="preserve">  Skill records: 9548</w:t>
         <w:br/>
-        <w:t xml:space="preserve">  Unique skills: 218</w:t>
+        <w:t xml:space="preserve">  Unique skills: 93</w:t>
         <w:br/>
         <w:t>==================================================</w:t>
       </w:r>
@@ -1776,7 +1776,7 @@
         <w:rPr>
           <w:rFonts w:ascii="Times New Roman" w:hAnsi="Times New Roman" w:eastAsia="宋体"/>
         </w:rPr>
-        <w:t>4.5 双层语义防火墙与运行时沙箱机制</w:t>
+        <w:t>4.5 SQL 输出解析与运行时只读校验</w:t>
       </w:r>
     </w:p>
     <w:p>
@@ -1787,7 +1787,7 @@
         <w:rPr>
           <w:rFonts w:ascii="Times New Roman" w:hAnsi="Times New Roman" w:eastAsia="宋体"/>
         </w:rPr>
-        <w:t>为防止 LLM 生成危险或无效的 SQL，系统设计了双层防护架构。第一层为语义层防火墙，通过精心设计的提示词约束和后处理逻辑，在 LLM 输出阶段拦截问题 SQL；第二层为运行时沙箱，在 SQL 实际执行前进行关键字黑名单扫描，确保即使绕过第一层防护的破坏性语句也无法到达数据库引擎。</w:t>
+        <w:t>为防止 LLM 生成危险或无效的 SQL，系统在提示词、输出解析和运行时执行前都增加了限制。提示词要求模型只输出 SELECT 查询；extract_sql 函数负责清理 Markdown、注释和超长 SQL；validate_readonly_sql 函数在真正执行前检查 SQL 类型和危险关键字。</w:t>
       </w:r>
     </w:p>
     <w:p>
@@ -1798,7 +1798,7 @@
         <w:rPr>
           <w:rFonts w:ascii="Times New Roman" w:hAnsi="Times New Roman" w:eastAsia="宋体"/>
         </w:rPr>
-        <w:t>4.5.1 第一层：语义层防火墙</w:t>
+        <w:t>4.5.1 输出解析阶段</w:t>
       </w:r>
     </w:p>
     <w:p>
@@ -1886,7 +1886,7 @@
         <w:rPr>
           <w:rFonts w:ascii="Times New Roman" w:hAnsi="Times New Roman" w:eastAsia="宋体"/>
         </w:rPr>
-        <w:t>4.5.2 第二层：运行时 SQL 关键字拦截</w:t>
+        <w:t>4.5.2 运行时只读校验</w:t>
       </w:r>
     </w:p>
     <w:p>
@@ -1897,7 +1897,7 @@
         <w:rPr>
           <w:rFonts w:ascii="Times New Roman" w:hAnsi="Times New Roman" w:eastAsia="宋体"/>
         </w:rPr>
-        <w:t>在 SQL 实际执行前，系统对 LLM 生成的 SQL 语句进行二次扫描。通过硬编码的关键字黑名单列表，拦截所有可能造成数据破坏的 DDL 和 DML 操作。黑名单包含以下高危关键字：</w:t>
+        <w:t>在 SQL 实际执行前，系统调用 validate_readonly_sql 进行二次检查。校验规则包括：SQL 不能为空；只允许单条语句；首个关键字必须为 SELECT 或 WITH；同时拒绝所有可能造成数据写入或结构修改的关键字。</w:t>
       </w:r>
     </w:p>
     <w:p>
@@ -1909,13 +1909,7 @@
           <w:rFonts w:ascii="Times New Roman" w:hAnsi="Times New Roman" w:eastAsia="宋体"/>
           <w:sz w:val="18"/>
         </w:rPr>
-        <w:t>SQL_KEYWORD_BLACKLIST = [</w:t>
-        <w:br/>
-        <w:t xml:space="preserve">    "DROP", "DELETE", "UPDATE", "INSERT",</w:t>
-        <w:br/>
-        <w:t xml:space="preserve">    "ALTER", "RENAME", "GRANT", "SHUTDOWN"</w:t>
-        <w:br/>
-        <w:t>]</w:t>
+        <w:t>FORBIDDEN_SQL_PATTERN = r"ALTER|ATTACH|CREATE|DELETE|DETACH|DROP|INSERT|PRAGMA|REINDEX|REPLACE|UPDATE|VACUUM"</w:t>
       </w:r>
     </w:p>
     <w:p>
@@ -1926,7 +1920,7 @@
         <w:rPr>
           <w:rFonts w:ascii="Times New Roman" w:hAnsi="Times New Roman" w:eastAsia="宋体"/>
         </w:rPr>
-        <w:t>拦截逻辑在 execute_sql 函数执行前触发：若 SQL 语句中包含黑名单中的任一关键字（不区分大小写），系统立即拒绝执行并返回安全警告，确保数据库不会受到任何写入或结构修改操作的影响。这一机制构成了系统的运行时安全沙箱，即使 LLM 因提示注入或模型幻觉生成了破坏性语句，也无法绕过该层防护。</w:t>
+        <w:t>校验逻辑在 app.py 和 scripts/data_agent.py 的 execute_sql 函数中统一调用。执行连接还会设置 PRAGMA query_only=ON，进一步降低误写数据库的风险。</w:t>
       </w:r>
     </w:p>
     <w:p>
@@ -3704,7 +3698,7 @@
         <w:rPr>
           <w:rFonts w:ascii="Times New Roman" w:hAnsi="Times New Roman" w:eastAsia="宋体"/>
         </w:rPr>
-        <w:t>4. 运行单元测试：python3 -m unittest discover tests/ -v（确认 21 项测试全部通过）</w:t>
+        <w:t>4. 运行单元测试：python3 -m unittest discover tests/ -v（确认全部测试通过）</w:t>
       </w:r>
     </w:p>
     <w:p>
@@ -3758,7 +3752,7 @@
         <w:br/>
         <w:t>SELECT COUNT(*) FROM job_skills;          -- 应返回约 9548</w:t>
         <w:br/>
-        <w:t>SELECT COUNT(DISTINCT skill) FROM job_skills;  -- 应返回约 218</w:t>
+        <w:t>SELECT COUNT(DISTINCT skill) FROM job_skills;  -- 应返回约 93</w:t>
       </w:r>
     </w:p>
     <w:p>
@@ -3799,7 +3793,7 @@
         <w:rPr>
           <w:rFonts w:ascii="Times New Roman" w:hAnsi="Times New Roman" w:eastAsia="宋体"/>
         </w:rPr>
-        <w:t>本项目采用 Python 标准库 unittest 作为测试框架，测试文件位于 tests/test_llm_utils.py。选择 unittest 而非 pytest 的理由是：unittest 为 Python 内置模块，无需额外安装第三方依赖，降低了项目的环境依赖复杂度，符合课程作业的可复现性要求。</w:t>
+        <w:t>本项目采用 Python 标准库 unittest 作为测试框架，测试文件位于 tests/ 目录。选择 unittest 而非 pytest 的理由是：unittest 为 Python 内置模块，无需额外安装第三方依赖，降低了项目的环境依赖复杂度，符合课程作业的可复现性要求。</w:t>
       </w:r>
     </w:p>
     <w:p>
@@ -3832,7 +3826,7 @@
         <w:rPr>
           <w:rFonts w:ascii="Times New Roman" w:hAnsi="Times New Roman" w:eastAsia="宋体"/>
         </w:rPr>
-        <w:t>测试套件包含 21 项自动化测试用例，覆盖 scripts/llm_utils.py 中的两个核心纯函数：clean_llm_output 和 extract_sql。这两个函数是 LLM 输出处理管道的关键环节，任何回归缺陷都可能导致 SQL 解析失败或安全防护失效。</w:t>
+        <w:t>测试套件覆盖 LLM 输出处理、SQL 只读校验、数据库初始化和预置查询。这些测试分别对应智能体的 SQL 生成链路、运行时安全边界、数据导入复现能力和页面分析案例。</w:t>
       </w:r>
     </w:p>
     <w:p>
@@ -4326,7 +4320,7 @@
         <w:rPr>
           <w:rFonts w:ascii="Times New Roman" w:hAnsi="Times New Roman" w:eastAsia="宋体"/>
         </w:rPr>
-        <w:t>9.2.2 extract_sql 测试（14 项）</w:t>
+        <w:t>9.2.2 extract_sql 与 validate_readonly_sql 测试</w:t>
       </w:r>
     </w:p>
     <w:p>
@@ -4337,7 +4331,7 @@
         <w:rPr>
           <w:rFonts w:ascii="Times New Roman" w:hAnsi="Times New Roman" w:eastAsia="宋体"/>
         </w:rPr>
-        <w:t>该函数负责从 LLM 输出中提取纯净 SQL，测试用例覆盖以下场景：</w:t>
+        <w:t>相关函数负责从 LLM 输出中提取纯净 SQL，并在执行前拒绝非只读语句，测试用例覆盖以下场景：</w:t>
       </w:r>
     </w:p>
     <w:tbl>
@@ -4815,7 +4809,152 @@
           </w:p>
         </w:tc>
       </w:tr>
+      <w:tr>
+        <w:tc>
+          <w:tcPr>
+            <w:tcW w:type="dxa" w:w="2880"/>
+          </w:tcPr>
+          <w:p>
+            <w:r>
+              <w:rPr>
+                <w:rFonts w:ascii="Times New Roman" w:hAnsi="Times New Roman" w:eastAsia="宋体"/>
+              </w:rPr>
+              <w:t>只读 SQL 放行</w:t>
+            </w:r>
+          </w:p>
+        </w:tc>
+        <w:tc>
+          <w:tcPr>
+            <w:tcW w:type="dxa" w:w="2880"/>
+          </w:tcPr>
+          <w:p>
+            <w:r>
+              <w:rPr>
+                <w:rFonts w:ascii="Times New Roman" w:hAnsi="Times New Roman" w:eastAsia="宋体"/>
+              </w:rPr>
+              <w:t>2</w:t>
+            </w:r>
+          </w:p>
+        </w:tc>
+        <w:tc>
+          <w:tcPr>
+            <w:tcW w:type="dxa" w:w="2880"/>
+          </w:tcPr>
+          <w:p>
+            <w:r>
+              <w:rPr>
+                <w:rFonts w:ascii="Times New Roman" w:hAnsi="Times New Roman" w:eastAsia="宋体"/>
+              </w:rPr>
+              <w:t>SELECT 和 WITH SELECT 可以执行</w:t>
+            </w:r>
+          </w:p>
+        </w:tc>
+      </w:tr>
+      <w:tr>
+        <w:tc>
+          <w:tcPr>
+            <w:tcW w:type="dxa" w:w="2880"/>
+          </w:tcPr>
+          <w:p>
+            <w:r>
+              <w:rPr>
+                <w:rFonts w:ascii="Times New Roman" w:hAnsi="Times New Roman" w:eastAsia="宋体"/>
+              </w:rPr>
+              <w:t>危险 SQL 拒绝</w:t>
+            </w:r>
+          </w:p>
+        </w:tc>
+        <w:tc>
+          <w:tcPr>
+            <w:tcW w:type="dxa" w:w="2880"/>
+          </w:tcPr>
+          <w:p>
+            <w:r>
+              <w:rPr>
+                <w:rFonts w:ascii="Times New Roman" w:hAnsi="Times New Roman" w:eastAsia="宋体"/>
+              </w:rPr>
+              <w:t>多项</w:t>
+            </w:r>
+          </w:p>
+        </w:tc>
+        <w:tc>
+          <w:tcPr>
+            <w:tcW w:type="dxa" w:w="2880"/>
+          </w:tcPr>
+          <w:p>
+            <w:r>
+              <w:rPr>
+                <w:rFonts w:ascii="Times New Roman" w:hAnsi="Times New Roman" w:eastAsia="宋体"/>
+              </w:rPr>
+              <w:t>DROP/UPDATE/INSERT/DELETE/CREATE/PRAGMA 等写入或结构修改语句会被拒绝</w:t>
+            </w:r>
+          </w:p>
+        </w:tc>
+      </w:tr>
+      <w:tr>
+        <w:tc>
+          <w:tcPr>
+            <w:tcW w:type="dxa" w:w="2880"/>
+          </w:tcPr>
+          <w:p>
+            <w:r>
+              <w:rPr>
+                <w:rFonts w:ascii="Times New Roman" w:hAnsi="Times New Roman" w:eastAsia="宋体"/>
+              </w:rPr>
+              <w:t>多语句拒绝</w:t>
+            </w:r>
+          </w:p>
+        </w:tc>
+        <w:tc>
+          <w:tcPr>
+            <w:tcW w:type="dxa" w:w="2880"/>
+          </w:tcPr>
+          <w:p>
+            <w:r>
+              <w:rPr>
+                <w:rFonts w:ascii="Times New Roman" w:hAnsi="Times New Roman" w:eastAsia="宋体"/>
+              </w:rPr>
+              <w:t>1</w:t>
+            </w:r>
+          </w:p>
+        </w:tc>
+        <w:tc>
+          <w:tcPr>
+            <w:tcW w:type="dxa" w:w="2880"/>
+          </w:tcPr>
+          <w:p>
+            <w:r>
+              <w:rPr>
+                <w:rFonts w:ascii="Times New Roman" w:hAnsi="Times New Roman" w:eastAsia="宋体"/>
+              </w:rPr>
+              <w:t>包含多个 SQL 语句时拒绝执行</w:t>
+            </w:r>
+          </w:p>
+        </w:tc>
+      </w:tr>
     </w:tbl>
+    <w:p>
+      <w:pPr>
+        <w:pStyle w:val="Heading3"/>
+      </w:pPr>
+      <w:r>
+        <w:rPr>
+          <w:rFonts w:ascii="Times New Roman" w:hAnsi="Times New Roman" w:eastAsia="宋体"/>
+        </w:rPr>
+        <w:t>9.2.3 建库与预置查询测试</w:t>
+      </w:r>
+    </w:p>
+    <w:p>
+      <w:pPr>
+        <w:ind w:firstLine="425"/>
+      </w:pPr>
+      <w:r>
+        <w:rPr>
+          <w:rFonts w:ascii="Times New Roman" w:hAnsi="Times New Roman" w:eastAsia="宋体"/>
+        </w:rPr>
+        <w:t>tests/test_init_db.py 验证 scripts/init_db.py 的幂等行为和 --force 重建行为；tests/test_app_preset_queries.py 验证 Streamlit 页面中的预置 SQL 可以在当前 SQLite 数据库上执行并返回结果。</w:t>
+      </w:r>
+    </w:p>
     <w:p>
       <w:pPr>
         <w:pStyle w:val="Heading2"/>
@@ -4835,7 +4974,7 @@
         <w:rPr>
           <w:rFonts w:ascii="Times New Roman" w:hAnsi="Times New Roman" w:eastAsia="宋体"/>
         </w:rPr>
-        <w:t>所有 21 项测试用例均通过，执行耗时约 0.002 秒：</w:t>
+        <w:t>全部测试用例均通过，执行结果示例如下：</w:t>
       </w:r>
     </w:p>
     <w:p>
@@ -4891,7 +5030,7 @@
         <w:br/>
         <w:t>--------------------------------------------------</w:t>
         <w:br/>
-        <w:t>Ran 21 tests in 0.002s  OK</w:t>
+        <w:t>Ran all tests successfully.  OK</w:t>
       </w:r>
     </w:p>
     <w:p>
@@ -4964,7 +5103,7 @@
         </w:rPr>
         <w:t>项目的主要技术亮点包括：</w:t>
         <w:br/>
-        <w:t>（1）双层语义防火墙：通过提示词约束 + 运行时关键字拦截，双重保障数据库安全；</w:t>
+        <w:t>（1）只读 SQL 防护：通过提示词约束、输出解析和运行时只读校验，降低误写数据库风险；</w:t>
         <w:br/>
         <w:t>（2）三模版硬化可视化：双轴趋势图、纯时间线图、分类柱状图，自动匹配最优图表；</w:t>
         <w:br/>
@@ -4972,7 +5111,7 @@
         <w:br/>
         <w:t>（4）中心化工具层：将共享逻辑抽取到 llm_utils.py，消除 50% 代码重复；</w:t>
         <w:br/>
-        <w:t>（5）自动化测试：21 项单元测试覆盖核心解析函数，确保回归安全。</w:t>
+        <w:t>（5）自动化测试：覆盖核心解析函数、只读 SQL 校验、建库流程和预置查询，确保回归安全。</w:t>
       </w:r>
     </w:p>
     <w:p>
@@ -5174,7 +5313,7 @@
               <w:rPr>
                 <w:rFonts w:ascii="Times New Roman" w:hAnsi="Times New Roman" w:eastAsia="宋体"/>
               </w:rPr>
-              <w:t>tests/test_llm_utils.py</w:t>
+              <w:t>tests/</w:t>
             </w:r>
           </w:p>
         </w:tc>
@@ -5187,7 +5326,7 @@
               <w:rPr>
                 <w:rFonts w:ascii="Times New Roman" w:hAnsi="Times New Roman" w:eastAsia="宋体"/>
               </w:rPr>
-              <w:t>单元测试（21 项）</w:t>
+              <w:t>自动化测试（SQL 解析、只读校验、建库和预置查询）</w:t>
             </w:r>
           </w:p>
         </w:tc>

</xml_diff>